<commit_message>
Added new comments in the thesis document
</commit_message>
<xml_diff>
--- a/YM_thesis - in progress.docx
+++ b/YM_thesis - in progress.docx
@@ -182,7 +182,7 @@
         <w:jc w:val="both"/>
       </w:pPr>
       <w:r>
-        <w:t>To assess the validity of the homoskedasticity assumption, the Breusch-Pagan Lagrange Multiplier test was applied to all estimated cross-sectional specifications. The null hypothesis of the test states that the error variance is constant across observations (homoskedasticity), while the alternative hypothesis indicates that the variance of the residuals depends on the values of the independent variables (heteroskedasticity).</w:t>
+        <w:t>To assess the validity of the homoskedasticity assumption, the Breusch-Pagan test was applied to all estimated cross-sectional specifications. The null hypothesis of the test states that the error variance is constant across observations (homoskedasticity), while the alternative hypothesis indicates that the variance of the residuals depends on the values of the independent variables (heteroskedasticity).</w:t>
       </w:r>
     </w:p>
     <w:p>
@@ -258,7 +258,13 @@
         <w:t xml:space="preserve">, the HC3 variant of the heteroskedasticity-consistent covariance matrix estimator  was adopted for all specifications. </w:t>
       </w:r>
       <w:r>
-        <w:t>The HC3 estimator is preferred over the simpler HC0 (White, 1980) because it provides superior finite-sample performance and reduces over-rejection under the null hypothesis, which is particularly relevant given the modest sample size of 134 observations per cross-section.</w:t>
+        <w:t>The HC3 estimator is preferred over the simpler HC0</w:t>
+      </w:r>
+      <w:r>
+        <w:t xml:space="preserve">, suggested by White, </w:t>
+      </w:r>
+      <w:r>
+        <w:t>because it provides superior finite-sample performance and reduces over-rejection under the null hypothesis, which is particularly relevant given the modest sample size of 134 observations per cross-section.</w:t>
       </w:r>
     </w:p>
     <w:p>
@@ -289,7 +295,7 @@
         <w:jc w:val="both"/>
       </w:pPr>
       <w:r>
-        <w:t>The Ramsey Regression Equation Specification Error Test (RESET), developed by Ramsey (1969), was employed to assess whether the linear functional form is adequate for the estimated models. The RESET test examines whether non-linear combinations of the fitted values have explanatory power over the dependent variable. If they do, this indicates that the true data-generating process may involve polynomial, logarithmic, or other non-linear functional forms, and the linear specification is rejected.</w:t>
+        <w:t>The Ramsey Regression Equation Specification Error Test (RESET), developed by Ramsey, was employed to assess whether the linear functional form is adequate for the estimated models. The RESET test examines whether non-linear combinations of the fitted values have explanatory power over the dependent variable. If they do, this indicates that the true data-generating process may involve polynomial, logarithmic, or other non-linear functional forms, and the linear specification is rejected.</w:t>
       </w:r>
       <w:r>
         <w:t xml:space="preserve"> [</w:t>
@@ -306,7 +312,7 @@
         <w:jc w:val="both"/>
       </w:pPr>
       <w:r>
-        <w:t>Out of 40 models, 36 rejected the null hypothesis of correct functional form at the 5% significance level (p &lt; 0.05). Only four models</w:t>
+        <w:t>Out of 40 models, 36 rejected the null hypothesis of correct functional form at the 5% significance level. Only four models</w:t>
       </w:r>
       <w:r>
         <w:t xml:space="preserve"> (m</w:t>
@@ -318,7 +324,46 @@
         <w:t xml:space="preserve">) </w:t>
       </w:r>
       <w:r>
-        <w:t xml:space="preserve"> passed the RESET test. All four are wage-growth specifications for the year 2022, which further supports the interpretation that the extreme and uniform inflationary shock of 2022 produced a simpler, more linear data-generating process for short-term wage adjustments.</w:t>
+        <w:t xml:space="preserve"> passed the RESET test. All four are wage-growth specifications for the year 2022</w:t>
+      </w:r>
+      <w:r>
+        <w:t>,</w:t>
+      </w:r>
+      <w:r>
+        <w:t xml:space="preserve"> which </w:t>
+      </w:r>
+      <w:r>
+        <w:t>could indicate</w:t>
+      </w:r>
+      <w:r>
+        <w:t xml:space="preserve"> </w:t>
+      </w:r>
+      <w:r>
+        <w:t>the</w:t>
+      </w:r>
+      <w:r>
+        <w:t xml:space="preserve"> extreme and uniform inflationary shock of 2022</w:t>
+      </w:r>
+      <w:r>
+        <w:t xml:space="preserve"> [</w:t>
+      </w:r>
+      <w:r>
+        <w:rPr>
+          <w:highlight w:val="yellow"/>
+        </w:rPr>
+        <w:t>CB1, EU stat1</w:t>
+      </w:r>
+      <w:r>
+        <w:t>].</w:t>
+      </w:r>
+      <w:r>
+        <w:t xml:space="preserve"> </w:t>
+      </w:r>
+      <w:r>
+        <w:t xml:space="preserve">This shock </w:t>
+      </w:r>
+      <w:r>
+        <w:t>produced a simpler, more linear data-generating process for short-term wage adjustments.</w:t>
       </w:r>
     </w:p>
     <w:p>
@@ -326,7 +371,13 @@
         <w:jc w:val="both"/>
       </w:pPr>
       <w:r>
-        <w:t>For the wage-level models (Models 1–28), the RESET test was universally rejected (all p &lt; 0.001).</w:t>
+        <w:t>For the wage-level models (Models 1</w:t>
+      </w:r>
+      <w:r>
+        <w:t xml:space="preserve"> - </w:t>
+      </w:r>
+      <w:r>
+        <w:t>28), the RESET test was universally rejected (all p &lt; 0.001).</w:t>
       </w:r>
       <w:r>
         <w:t xml:space="preserve"> So,</w:t>
@@ -338,7 +389,19 @@
         <w:t>t</w:t>
       </w:r>
       <w:r>
-        <w:t>he rejection of the linear functional form in the baseline models (Models 1–8) directly motivated the inclusion of multiplicative interaction terms between AI adoption and ICT capacity variables in subsequent specifications (Models 9–28). The interaction terms partially capture the non-linear moderating relationship between technology adoption and wages</w:t>
+        <w:t>he rejection of the linear functional form in the baseline models (Models 1</w:t>
+      </w:r>
+      <w:r>
+        <w:t xml:space="preserve"> - </w:t>
+      </w:r>
+      <w:r>
+        <w:t>8) directly motivated the inclusion of multiplicative interaction terms between AI adoption and ICT capacity variables in subsequent specifications (Models 9</w:t>
+      </w:r>
+      <w:r>
+        <w:t xml:space="preserve"> - </w:t>
+      </w:r>
+      <w:r>
+        <w:t>28). The interaction terms partially capture the non-linear moderating relationship between technology adoption and wages</w:t>
       </w:r>
       <w:r>
         <w:t>.</w:t>
@@ -386,17 +449,22 @@
       </w:r>
     </w:p>
     <w:p>
+      <w:r>
+        <w:t xml:space="preserve">MULTICOLLINEARITY </w:t>
+      </w:r>
+      <w:r>
+        <w:t>–</w:t>
+      </w:r>
+      <w:r>
+        <w:t xml:space="preserve"> VIF</w:t>
+      </w:r>
+    </w:p>
+    <w:p>
       <w:pPr>
         <w:jc w:val="both"/>
       </w:pPr>
       <w:r>
         <w:lastRenderedPageBreak/>
-        <w:t xml:space="preserve">MULTICOLLINEARITY </w:t>
-      </w:r>
-      <w:r>
-        <w:t>- VIF</w:t>
-      </w:r>
-      <w:r>
         <w:br/>
       </w:r>
       <w:r>
@@ -557,7 +625,25 @@
         <w:jc w:val="both"/>
       </w:pPr>
       <w:r>
-        <w:t>Second, the baseline models revealed high VIFs among the share of high-skill occupations (VIF = 56–66), tertiary education (VIF = 33–37), and the NACE sector J (Information and Communication) dummy (VIF = 27–37). This reflects the structural overlap between these variables: Sector J is almost exclusively composed of high-skill, highly educated workers. To avoid this collinearity in the main AI-ICT specifications, education and occupation share were dropped, and sector fixed effects were retained to absorb sector-specific workforce composition.</w:t>
+        <w:t>Second, the baseline models revealed high VIFs among the share of high-skill occupations (VIF = 56</w:t>
+      </w:r>
+      <w:r>
+        <w:t xml:space="preserve"> - </w:t>
+      </w:r>
+      <w:r>
+        <w:t>66), tertiary education (VIF = 33</w:t>
+      </w:r>
+      <w:r>
+        <w:t xml:space="preserve"> - </w:t>
+      </w:r>
+      <w:r>
+        <w:t>37), and the NACE sector J (Information and Communication) dummy (VIF = 27</w:t>
+      </w:r>
+      <w:r>
+        <w:t xml:space="preserve"> - </w:t>
+      </w:r>
+      <w:r>
+        <w:t>37). This reflects the structural overlap between these variables: Sector J is almost exclusively composed of high-skill, highly educated workers. To avoid this collinearity in the main AI-ICT specifications, education and occupation share were dropped, and sector fixed effects were retained to absorb sector-specific workforce composition.</w:t>
       </w:r>
     </w:p>
     <w:p>
@@ -565,7 +651,25 @@
         <w:jc w:val="both"/>
       </w:pPr>
       <w:r>
-        <w:t>Third, the introduction of the interaction term between AI adoption and ICT capacity substantially inflated VIFs for the base AI variable (from 9.7–19.4 to 39.2–81.7) and the interaction term itself (29.8–55.9). This</w:t>
+        <w:t>Third, the introduction of the interaction term between AI adoption and ICT capacity substantially inflated VIFs for the base AI variable (from 9.7</w:t>
+      </w:r>
+      <w:r>
+        <w:t xml:space="preserve"> - </w:t>
+      </w:r>
+      <w:r>
+        <w:t>19.4 to 39.2</w:t>
+      </w:r>
+      <w:r>
+        <w:t xml:space="preserve"> - </w:t>
+      </w:r>
+      <w:r>
+        <w:t>81.7) and the interaction term itself (29.8</w:t>
+      </w:r>
+      <w:r>
+        <w:t xml:space="preserve"> - </w:t>
+      </w:r>
+      <w:r>
+        <w:t>55.9). This</w:t>
       </w:r>
       <w:r>
         <w:t xml:space="preserve"> situation is aligned  with</w:t>
@@ -625,128 +729,143 @@
         <w:t>inflates their standard errors, making significance harder to achieve</w:t>
       </w:r>
       <w:r>
+        <w:t xml:space="preserve"> [</w:t>
+      </w:r>
+      <w:r>
+        <w:rPr>
+          <w:highlight w:val="yellow"/>
+        </w:rPr>
+        <w:t>W</w:t>
+      </w:r>
+      <w:r>
+        <w:rPr>
+          <w:highlight w:val="yellow"/>
+        </w:rPr>
+        <w:t xml:space="preserve"> 2013</w:t>
+      </w:r>
+      <w:r>
+        <w:rPr>
+          <w:highlight w:val="yellow"/>
+        </w:rPr>
+        <w:t>,</w:t>
+      </w:r>
+      <w:r>
+        <w:rPr>
+          <w:highlight w:val="yellow"/>
+        </w:rPr>
         <w:t xml:space="preserve"> </w:t>
       </w:r>
-      <w:r>
+      <w:proofErr w:type="spellStart"/>
+      <w:r>
+        <w:rPr>
+          <w:highlight w:val="yellow"/>
+        </w:rPr>
+        <w:t>c</w:t>
+      </w:r>
+      <w:r>
+        <w:rPr>
+          <w:highlight w:val="yellow"/>
+        </w:rPr>
+        <w:t>h.</w:t>
+      </w:r>
+      <w:proofErr w:type="spellEnd"/>
+      <w:r>
+        <w:rPr>
+          <w:highlight w:val="yellow"/>
+        </w:rPr>
+        <w:t xml:space="preserve"> 3</w:t>
+      </w:r>
+      <w:r>
+        <w:t>]</w:t>
+      </w:r>
+      <w:r>
+        <w:t>.</w:t>
+      </w:r>
+      <w:r>
+        <w:t xml:space="preserve"> Following Allison, high VIFs arising from interaction terms were not treated as grounds for model re-specification. Instead, inference on the moderating effect was based on marginal effects calculations, which combine the main and interaction coefficients and are not distorted by structural multicollinearity.</w:t>
+      </w:r>
+      <w:r>
+        <w:rPr>
+          <w:highlight w:val="yellow"/>
+        </w:rPr>
+        <w:t xml:space="preserve"> </w:t>
+      </w:r>
+      <w:r>
+        <w:rPr>
+          <w:highlight w:val="yellow"/>
+        </w:rPr>
         <w:t>[</w:t>
       </w:r>
       <w:r>
         <w:rPr>
           <w:highlight w:val="yellow"/>
         </w:rPr>
-        <w:t>W</w:t>
+        <w:t>Allis</w:t>
       </w:r>
       <w:r>
         <w:rPr>
           <w:highlight w:val="yellow"/>
         </w:rPr>
-        <w:t xml:space="preserve"> 2013</w:t>
+        <w:t>]</w:t>
+      </w:r>
+    </w:p>
+    <w:p>
+      <w:pPr>
+        <w:jc w:val="both"/>
+      </w:pPr>
+      <w:r>
+        <w:t xml:space="preserve">Finally, </w:t>
+      </w:r>
+      <w:r>
+        <w:t xml:space="preserve">VIF analysis for the wage-growth specifications reveals a </w:t>
+      </w:r>
+      <w:r>
+        <w:t>more</w:t>
+      </w:r>
+      <w:r>
+        <w:t xml:space="preserve"> cleaner collinearity structure compared to the wage-level models. The substitution of country fixed effects with explicit macroeconomic controls eliminated the perfect collinearity observed in the level models and reduced the VIF of the AI adoption variable by approximately half. All macroeconomic controls remained well below the conventional threshold of 10</w:t>
+      </w:r>
+      <w:r>
+        <w:t xml:space="preserve"> </w:t>
       </w:r>
       <w:r>
         <w:rPr>
           <w:highlight w:val="yellow"/>
         </w:rPr>
+        <w:t>[res]</w:t>
+      </w:r>
+      <w:r>
+        <w:rPr>
+          <w:highlight w:val="yellow"/>
+        </w:rPr>
         <w:t>,</w:t>
       </w:r>
       <w:r>
-        <w:rPr>
-          <w:highlight w:val="yellow"/>
-        </w:rPr>
-        <w:t xml:space="preserve"> </w:t>
-      </w:r>
-      <w:proofErr w:type="spellStart"/>
-      <w:r>
-        <w:rPr>
-          <w:highlight w:val="yellow"/>
-        </w:rPr>
-        <w:t>c</w:t>
-      </w:r>
-      <w:r>
-        <w:rPr>
-          <w:highlight w:val="yellow"/>
-        </w:rPr>
-        <w:t>h.</w:t>
-      </w:r>
-      <w:proofErr w:type="spellEnd"/>
-      <w:r>
-        <w:rPr>
-          <w:highlight w:val="yellow"/>
-        </w:rPr>
-        <w:t xml:space="preserve"> 3</w:t>
-      </w:r>
-      <w:r>
-        <w:t>]</w:t>
-      </w:r>
-      <w:r>
-        <w:t>.</w:t>
-      </w:r>
-      <w:r>
-        <w:t xml:space="preserve"> Following Allison, high VIFs arising from interaction terms were not treated as grounds for model re-specification. Instead, inference on the moderating effect was based on marginal effects calculations, which combine the main and interaction coefficients and are not distorted by structural multicollinearity.</w:t>
-      </w:r>
-      <w:r>
-        <w:rPr>
-          <w:highlight w:val="yellow"/>
-        </w:rPr>
-        <w:t xml:space="preserve"> </w:t>
-      </w:r>
-      <w:r>
-        <w:rPr>
-          <w:highlight w:val="yellow"/>
-        </w:rPr>
-        <w:t>[</w:t>
-      </w:r>
-      <w:r>
-        <w:rPr>
-          <w:highlight w:val="yellow"/>
-        </w:rPr>
-        <w:t>Allis</w:t>
-      </w:r>
-      <w:r>
-        <w:rPr>
-          <w:highlight w:val="yellow"/>
-        </w:rPr>
-        <w:t>]</w:t>
-      </w:r>
-    </w:p>
-    <w:p>
-      <w:pPr>
-        <w:jc w:val="both"/>
-      </w:pPr>
-      <w:r>
-        <w:t xml:space="preserve">Finally, </w:t>
-      </w:r>
-      <w:r>
-        <w:t xml:space="preserve">VIF analysis for the wage-growth specifications reveals a </w:t>
-      </w:r>
-      <w:r>
-        <w:t>more</w:t>
-      </w:r>
-      <w:r>
-        <w:t xml:space="preserve"> cleaner collinearity structure compared to the wage-level models. The substitution of country fixed effects with explicit macroeconomic controls eliminated the perfect collinearity observed in the level models and reduced the VIF of the AI adoption variable by approximately half. All macroeconomic controls remained well below the conventional threshold of 10</w:t>
-      </w:r>
-      <w:r>
-        <w:t xml:space="preserve"> </w:t>
-      </w:r>
-      <w:r>
-        <w:rPr>
-          <w:highlight w:val="yellow"/>
-        </w:rPr>
-        <w:t>[res]</w:t>
-      </w:r>
-      <w:r>
-        <w:rPr>
-          <w:highlight w:val="yellow"/>
-        </w:rPr>
+        <w:t xml:space="preserve"> confirming the validity of their simultaneous inclusion. In the base specifications without interaction terms, the AI adoption variable exhibited VIFs between 4.3 and 7.6, while ICT training ranged from 9.9 to 10.8 and ICT specialists from 15.6 to 17.1 </w:t>
+      </w:r>
+      <w:r>
+        <w:t xml:space="preserve">, </w:t>
+      </w:r>
+      <w:r>
+        <w:t xml:space="preserve"> all within or near acceptable bounds. When the interaction term was introduced, the expected structural inflation occurred (AI VIF rising to 15.5</w:t>
+      </w:r>
+      <w:r>
+        <w:t xml:space="preserve"> - </w:t>
+      </w:r>
+      <w:r>
+        <w:t>32.4</w:t>
+      </w:r>
+      <w:r>
         <w:t>,</w:t>
       </w:r>
       <w:r>
-        <w:t xml:space="preserve"> confirming the validity of their simultaneous inclusion. In the base specifications without interaction terms, the AI adoption variable exhibited VIFs between 4.3 and 7.6, while ICT training ranged from 9.9 to 10.8 and ICT specialists from 15.6 to 17.1 — all within or near acceptable bounds. When the interaction term was introduced, the expected structural inflation occurred (AI VIF rising to 15.5–32.4</w:t>
-      </w:r>
-      <w:r>
-        <w:t>,</w:t>
-      </w:r>
-      <w:r>
-        <w:t xml:space="preserve"> interaction VIF to 19.4–33.6), consistent with the mechanical collinearity</w:t>
+        <w:t xml:space="preserve"> interaction VIF to 19.4</w:t>
+      </w:r>
+      <w:r>
+        <w:t xml:space="preserve"> - </w:t>
+      </w:r>
+      <w:r>
+        <w:t>33.6), consistent with the mechanical collinearity</w:t>
       </w:r>
       <w:r>
         <w:t xml:space="preserve"> </w:t>
@@ -808,58 +927,67 @@
         <w:t>, and information criteria (AIC and BIC).</w:t>
       </w:r>
       <w:r>
+        <w:t xml:space="preserve"> [</w:t>
+      </w:r>
+      <w:r>
+        <w:rPr>
+          <w:highlight w:val="yellow"/>
+        </w:rPr>
+        <w:t>W</w:t>
+      </w:r>
+      <w:r>
+        <w:rPr>
+          <w:highlight w:val="yellow"/>
+        </w:rPr>
+        <w:t xml:space="preserve"> 2013</w:t>
+      </w:r>
+      <w:r>
+        <w:t>]</w:t>
+      </w:r>
+      <w:r>
+        <w:t xml:space="preserve"> All wage-level specifications with country and sector fixed effects achieved R</w:t>
+      </w:r>
+      <w:r>
+        <w:t>^2</w:t>
+      </w:r>
+      <w:r>
+        <w:t xml:space="preserve"> values between 0.978 and 0.984, with adjusted R</w:t>
+      </w:r>
+      <w:r>
+        <w:t>^2</w:t>
+      </w:r>
+      <w:r>
+        <w:t xml:space="preserve"> between 0.970 and 0.978. The high explanatory power is expected in cross-country sectoral wage equations, where the country fixed effects absorb the dominant share of wage dispersion across Europ</w:t>
+      </w:r>
+      <w:r>
+        <w:t>e</w:t>
+      </w:r>
+      <w:r>
+        <w:t>. The narrow gap between R</w:t>
+      </w:r>
+      <w:r>
+        <w:t>^2</w:t>
+      </w:r>
+      <w:r>
+        <w:t xml:space="preserve"> and adjusted </w:t>
+      </w:r>
+      <w:r>
+        <w:t>R</w:t>
+      </w:r>
+      <w:r>
+        <w:t>^2</w:t>
+      </w:r>
+      <w:r>
         <w:t xml:space="preserve"> </w:t>
       </w:r>
       <w:r>
-        <w:t>[</w:t>
-      </w:r>
-      <w:r>
-        <w:rPr>
-          <w:highlight w:val="yellow"/>
-        </w:rPr>
-        <w:t>W</w:t>
-      </w:r>
-      <w:r>
-        <w:rPr>
-          <w:highlight w:val="yellow"/>
-        </w:rPr>
-        <w:t xml:space="preserve"> 2013</w:t>
-      </w:r>
-      <w:r>
-        <w:t>]</w:t>
-      </w:r>
-      <w:r>
-        <w:t xml:space="preserve"> All wage-level specifications with country and sector fixed effects achieved R</w:t>
-      </w:r>
-      <w:r>
-        <w:t>^2</w:t>
-      </w:r>
-      <w:r>
-        <w:t xml:space="preserve"> values between 0.978 and 0.984, with adjusted R² between 0.970 and 0.978. The high explanatory power is expected in cross-country sectoral wage equations, where the country fixed effects absorb the dominant share of wage dispersion across Europ</w:t>
-      </w:r>
-      <w:r>
-        <w:t>e</w:t>
-      </w:r>
-      <w:r>
-        <w:t>. The narrow gap between R</w:t>
-      </w:r>
-      <w:r>
-        <w:t>^2</w:t>
-      </w:r>
-      <w:r>
-        <w:t xml:space="preserve"> and adjusted </w:t>
-      </w:r>
-      <w:r>
-        <w:t>R</w:t>
-      </w:r>
-      <w:r>
-        <w:t>^2</w:t>
-      </w:r>
-      <w:r>
-        <w:t xml:space="preserve"> </w:t>
-      </w:r>
-      <w:r>
-        <w:t xml:space="preserve"> (0.5–0.8 percentage points) indicates that the included regressors contribute meaningful explanatory power beyond what would be expected by chance alone.</w:t>
+        <w:t xml:space="preserve"> (0.5</w:t>
+      </w:r>
+      <w:r>
+        <w:t xml:space="preserve"> - </w:t>
+      </w:r>
+      <w:r>
+        <w:t>0.8 percentage points) indicates that the included regressors contribute meaningful explanatory power beyond what would be expected by chance alone.</w:t>
       </w:r>
     </w:p>
     <w:p>
@@ -907,7 +1035,7 @@
         <w:t xml:space="preserve">. </w:t>
       </w:r>
       <w:r>
-        <w:t xml:space="preserve">This pattern held across all four years, confirming that the multiplicative interaction between AI adoption and ICT capacity provides a statistically superior </w:t>
+        <w:t xml:space="preserve">This pattern held across all four years, confirming that the interaction between AI adoption and ICT capacity provides a statistically superior </w:t>
       </w:r>
       <w:r>
         <w:t>description</w:t>
@@ -916,7 +1044,6 @@
         <w:t xml:space="preserve"> of the wage-determination process.</w:t>
       </w:r>
     </w:p>
-    <w:p/>
     <w:p>
       <w:pPr>
         <w:rPr>
@@ -992,13 +1119,37 @@
         <w:t xml:space="preserve">Model 4 with no country FE and excluded GDP variable has R square 0.804 and Model 3 with country FE and excluded GDP variable has R square 0.981. </w:t>
       </w:r>
       <w:r>
-        <w:t xml:space="preserve">This confirms that any analysis without Country FE (or strong country controls like HICP/GDP) risks Omitted Variable Bias. The fact that </w:t>
+        <w:t xml:space="preserve">This confirms that any analysis without Country FE (or strong country controls like HICP/GDP) risks </w:t>
+      </w:r>
+      <w:r>
+        <w:t>o</w:t>
+      </w:r>
+      <w:r>
+        <w:t xml:space="preserve">mitted </w:t>
+      </w:r>
+      <w:r>
+        <w:t>v</w:t>
+      </w:r>
+      <w:r>
+        <w:t xml:space="preserve">ariable </w:t>
+      </w:r>
+      <w:r>
+        <w:t>b</w:t>
+      </w:r>
+      <w:r>
+        <w:t xml:space="preserve">ias. The fact that </w:t>
       </w:r>
       <w:r>
         <w:t>R square</w:t>
       </w:r>
       <w:r>
-        <w:t xml:space="preserve"> jumps so high suggests that national wage setting institutions (unions, minimum wages, price levels) are massive drivers of the wage level.</w:t>
+        <w:t xml:space="preserve"> jumps so high</w:t>
+      </w:r>
+      <w:r>
+        <w:t xml:space="preserve"> again</w:t>
+      </w:r>
+      <w:r>
+        <w:t xml:space="preserve"> suggests that national wage setting institutions (unions, minimum wages, price levels) are massive drivers of the wage level.</w:t>
       </w:r>
     </w:p>
     <w:p>
@@ -1047,7 +1198,50 @@
         <w:t>within a specific country (Model 3), being a slightly more productive sector only yields a small wage premium</w:t>
       </w:r>
       <w:r>
-        <w:t xml:space="preserve">. </w:t>
+        <w:t xml:space="preserve"> </w:t>
+      </w:r>
+      <w:r>
+        <w:rPr>
+          <w:highlight w:val="red"/>
+        </w:rPr>
+        <w:t>[</w:t>
+      </w:r>
+      <w:proofErr w:type="spellStart"/>
+      <w:r>
+        <w:rPr>
+          <w:highlight w:val="red"/>
+        </w:rPr>
+        <w:t>Acemogl</w:t>
+      </w:r>
+      <w:proofErr w:type="spellEnd"/>
+      <w:r>
+        <w:rPr>
+          <w:highlight w:val="red"/>
+        </w:rPr>
+        <w:t xml:space="preserve"> and </w:t>
+      </w:r>
+      <w:proofErr w:type="spellStart"/>
+      <w:r>
+        <w:rPr>
+          <w:highlight w:val="red"/>
+        </w:rPr>
+        <w:t>Restepo</w:t>
+      </w:r>
+      <w:proofErr w:type="spellEnd"/>
+      <w:r>
+        <w:rPr>
+          <w:highlight w:val="red"/>
+        </w:rPr>
+        <w:t>]</w:t>
+      </w:r>
+      <w:r>
+        <w:rPr>
+          <w:highlight w:val="red"/>
+        </w:rPr>
+        <w:t>.</w:t>
+      </w:r>
+      <w:r>
+        <w:t xml:space="preserve"> </w:t>
       </w:r>
     </w:p>
     <w:p>
@@ -1087,248 +1281,6 @@
       </w:r>
       <w:r>
         <w:t>.</w:t>
-      </w:r>
-    </w:p>
-    <w:p>
-      <w:pPr>
-        <w:jc w:val="both"/>
-        <w:rPr>
-          <w:highlight w:val="yellow"/>
-        </w:rPr>
-      </w:pPr>
-      <w:r>
-        <w:t xml:space="preserve">Testing the models specification, in every single model (1 through 6), the Breusch-Pagan test returns a p-value &lt; 0.05 (often &lt; 0.001). Our error terms do not have constant variance. This is expected in cross-country wage data (large countries like Germany have different variance than small ones like Malta). The standard errors should be used in the final regressions. </w:t>
-      </w:r>
-      <w:r>
-        <w:t xml:space="preserve">Additionally, </w:t>
-      </w:r>
-      <w:r>
-        <w:t>in every single model, the Ramsey RESET test is highly significant (p &lt; 0.001</w:t>
-      </w:r>
-      <w:r>
-        <w:t>).</w:t>
-      </w:r>
-      <w:r>
-        <w:t xml:space="preserve"> </w:t>
-      </w:r>
-      <w:r>
-        <w:t>It</w:t>
-      </w:r>
-      <w:r>
-        <w:t xml:space="preserve"> rejected the linear specification, motivating the inclusion of interaction terms to capture non-linear moderation effects.</w:t>
-      </w:r>
-      <w:r>
-        <w:t xml:space="preserve"> Regarding the Jarque-Bera test results, </w:t>
-      </w:r>
-      <w:r>
-        <w:t>t</w:t>
-      </w:r>
-      <w:r>
-        <w:t>he Fixed Effects models (1, 3, 5) fit the data distribution much better. The non-FE models leave behind some skewness</w:t>
-      </w:r>
-      <w:r>
-        <w:t xml:space="preserve">, </w:t>
-      </w:r>
-      <w:r>
-        <w:t>likely</w:t>
-      </w:r>
-      <w:r>
-        <w:t xml:space="preserve">, </w:t>
-      </w:r>
-      <w:r>
-        <w:t xml:space="preserve"> because they fail to account for the specific wage structures of different countries. We need to rely more on the FE models (1, 3, 5) for inference, as their residuals satisfy the normality assumption better.</w:t>
-      </w:r>
-    </w:p>
-    <w:p>
-      <w:pPr>
-        <w:rPr>
-          <w:highlight w:val="yellow"/>
-        </w:rPr>
-      </w:pPr>
-      <w:r>
-        <w:t xml:space="preserve">Conducting the VIF analysis, we could see the massive condition number for the </w:t>
-      </w:r>
-      <w:r>
-        <w:t xml:space="preserve">models with FE (Models 1, 3, 5) and moderate number for the models without FE (Models 2, 4, 6). </w:t>
-      </w:r>
-      <w:r>
-        <w:t xml:space="preserve">The massive </w:t>
-      </w:r>
-      <w:r>
-        <w:lastRenderedPageBreak/>
-        <w:t xml:space="preserve">condition number in the FE models confirms the "perfect collinearity". </w:t>
-      </w:r>
-      <w:r>
-        <w:t>It</w:t>
-      </w:r>
-      <w:r>
-        <w:t>'s a signal that we should typically drop the explicit macro variables (Inflation, Unemployment) when using Country FE.</w:t>
-      </w:r>
-      <w:r>
-        <w:t xml:space="preserve"> </w:t>
-      </w:r>
-    </w:p>
-    <w:p>
-      <w:pPr>
-        <w:jc w:val="both"/>
-        <w:rPr>
-          <w:highlight w:val="yellow"/>
-        </w:rPr>
-      </w:pPr>
-      <w:r>
-        <w:t xml:space="preserve">Additionally, we could observe the “skill cluster” in Models 1, 3, 5: </w:t>
-      </w:r>
-      <w:proofErr w:type="spellStart"/>
-      <w:r>
-        <w:t>h_skill_ij</w:t>
-      </w:r>
-      <w:proofErr w:type="spellEnd"/>
-      <w:r>
-        <w:t xml:space="preserve">: VIF is 66.2, </w:t>
-      </w:r>
-      <w:proofErr w:type="spellStart"/>
-      <w:r>
-        <w:t>educ_ij</w:t>
-      </w:r>
-      <w:proofErr w:type="spellEnd"/>
-      <w:r>
-        <w:t xml:space="preserve">: VIF is 37.2 and C(nace_r2)[T.J] VIF is 27.2.  </w:t>
-      </w:r>
-      <w:r>
-        <w:rPr>
-          <w:highlight w:val="yellow"/>
-        </w:rPr>
-        <w:t xml:space="preserve">[REFERENCE TO THE GITHUB JUPITER NOTEBOOK]. </w:t>
-      </w:r>
-      <w:r>
-        <w:t xml:space="preserve">This is dangerously high </w:t>
-      </w:r>
-      <w:r>
-        <w:t xml:space="preserve">and </w:t>
-      </w:r>
-      <w:r>
-        <w:t>means the model can</w:t>
-      </w:r>
-      <w:r>
-        <w:t>’</w:t>
-      </w:r>
-      <w:r>
-        <w:t xml:space="preserve">t tell the difference between </w:t>
-      </w:r>
-      <w:r>
-        <w:t>h</w:t>
-      </w:r>
-      <w:r>
-        <w:t xml:space="preserve">igh </w:t>
-      </w:r>
-      <w:r>
-        <w:t>s</w:t>
-      </w:r>
-      <w:r>
-        <w:t xml:space="preserve">kill </w:t>
-      </w:r>
-      <w:r>
-        <w:t>o</w:t>
-      </w:r>
-      <w:r>
-        <w:t xml:space="preserve">ccupation, </w:t>
-      </w:r>
-      <w:r>
-        <w:t>t</w:t>
-      </w:r>
-      <w:r>
-        <w:t xml:space="preserve">ertiary </w:t>
-      </w:r>
-      <w:r>
-        <w:t>e</w:t>
-      </w:r>
-      <w:r>
-        <w:t xml:space="preserve">ducation, and </w:t>
-      </w:r>
-      <w:r>
-        <w:t>t</w:t>
-      </w:r>
-      <w:r>
-        <w:t xml:space="preserve">he </w:t>
-      </w:r>
-      <w:r>
-        <w:t>t</w:t>
-      </w:r>
-      <w:r>
-        <w:t xml:space="preserve">ech </w:t>
-      </w:r>
-      <w:r>
-        <w:t>s</w:t>
-      </w:r>
-      <w:r>
-        <w:t>ector (J)</w:t>
-      </w:r>
-      <w:r>
-        <w:t xml:space="preserve">. </w:t>
-      </w:r>
-      <w:r>
-        <w:t xml:space="preserve"> Sector J (Information/Communication) is almost purely defined by high-skill, high-education workers. We could think about dropping </w:t>
-      </w:r>
-      <w:proofErr w:type="spellStart"/>
-      <w:r>
-        <w:t>educ_ij</w:t>
-      </w:r>
-      <w:proofErr w:type="spellEnd"/>
-      <w:r>
-        <w:t xml:space="preserve"> or both </w:t>
-      </w:r>
-      <w:proofErr w:type="spellStart"/>
-      <w:r>
-        <w:t>educ_ij</w:t>
-      </w:r>
-      <w:proofErr w:type="spellEnd"/>
-      <w:r>
-        <w:t xml:space="preserve"> and </w:t>
-      </w:r>
-      <w:proofErr w:type="spellStart"/>
-      <w:r>
-        <w:t>h_skill_ij</w:t>
-      </w:r>
-      <w:proofErr w:type="spellEnd"/>
-      <w:r>
-        <w:t xml:space="preserve">. However, occupational skill </w:t>
-      </w:r>
-      <w:r>
-        <w:t xml:space="preserve">usually has a more direct link to wages. Or, drop both if we are including Sector FE and want to focus purely on AI/ICT as the new skill variable. </w:t>
-      </w:r>
-    </w:p>
-    <w:p>
-      <w:pPr>
-        <w:jc w:val="both"/>
-      </w:pPr>
-      <w:r>
-        <w:t xml:space="preserve">Regarding the productivity and GDP variable relations, </w:t>
-      </w:r>
-      <w:r>
-        <w:t xml:space="preserve"> </w:t>
-      </w:r>
-      <w:r>
-        <w:t>w</w:t>
-      </w:r>
-      <w:r>
-        <w:t xml:space="preserve">hen we remove GDP (Model 4), the VIF for </w:t>
-      </w:r>
-      <w:proofErr w:type="spellStart"/>
-      <w:r>
-        <w:t>log_prdct_ij</w:t>
-      </w:r>
-      <w:proofErr w:type="spellEnd"/>
-      <w:r>
-        <w:t xml:space="preserve"> drops to 1.6. It suggests that without GDP, </w:t>
-      </w:r>
-      <w:r>
-        <w:t>p</w:t>
-      </w:r>
-      <w:r>
-        <w:t>roductivity captures both the sector's efficiency and the country's development level.</w:t>
-      </w:r>
-      <w:r>
-        <w:t xml:space="preserve"> </w:t>
       </w:r>
     </w:p>
     <w:p>
@@ -1755,10 +1707,7 @@
           </w:tcPr>
           <w:p>
             <w:r>
-              <w:t>-</w:t>
-            </w:r>
-            <w:r>
-              <w:t>0.022***  (0.009)</w:t>
+              <w:t>-0.022***  (0.009)</w:t>
             </w:r>
           </w:p>
         </w:tc>
@@ -1887,10 +1836,7 @@
           </w:tcPr>
           <w:p>
             <w:r>
-              <w:t>-0.013</w:t>
-            </w:r>
-            <w:r>
-              <w:t>*** (0.006)</w:t>
+              <w:t>-0.013*** (0.006)</w:t>
             </w:r>
           </w:p>
         </w:tc>
@@ -1963,6 +1909,7 @@
           </w:tcPr>
           <w:p>
             <w:r>
+              <w:lastRenderedPageBreak/>
               <w:t>2021</w:t>
             </w:r>
           </w:p>
@@ -2458,10 +2405,7 @@
               <w:t>***  (</w:t>
             </w:r>
             <w:r>
-              <w:t>0.006</w:t>
-            </w:r>
-            <w:r>
-              <w:t>)</w:t>
+              <w:t>0.006)</w:t>
             </w:r>
           </w:p>
         </w:tc>
@@ -2776,7 +2720,6 @@
     <w:p/>
     <w:p>
       <w:r>
-        <w:lastRenderedPageBreak/>
         <w:t xml:space="preserve">Marginal effects ICT training </w:t>
       </w:r>
     </w:p>
@@ -3012,6 +2955,126 @@
         </w:rPr>
       </w:pPr>
       <w:r>
+        <w:rPr>
+          <w:i/>
+          <w:iCs/>
+          <w:highlight w:val="yellow"/>
+        </w:rPr>
+        <w:t>A notable pattern across all cross-sectional wage-level specifications is the reversal in the sign of the AI adoption coefficient upon introduction of the interaction term. In the</w:t>
+      </w:r>
+      <w:r>
+        <w:rPr>
+          <w:i/>
+          <w:iCs/>
+          <w:highlight w:val="yellow"/>
+        </w:rPr>
+        <w:t xml:space="preserve"> basic</w:t>
+      </w:r>
+      <w:r>
+        <w:rPr>
+          <w:i/>
+          <w:iCs/>
+          <w:highlight w:val="yellow"/>
+        </w:rPr>
+        <w:t xml:space="preserve"> specifications, AI adoption exhibits a consistently negative and statistically significant association with log wages (β ranging from −0.007 to −0.013, p &lt; 0.05). However, in the interaction specifications, the AI coefficient becomes positive (0.004 to 0.012) and statistically insignificant, while the interaction term (AI × ICT capacity) is negative and highly significant.</w:t>
+      </w:r>
+    </w:p>
+    <w:p>
+      <w:pPr>
+        <w:jc w:val="both"/>
+        <w:rPr>
+          <w:i/>
+          <w:iCs/>
+        </w:rPr>
+      </w:pPr>
+      <w:r>
+        <w:rPr>
+          <w:i/>
+          <w:iCs/>
+          <w:highlight w:val="yellow"/>
+        </w:rPr>
+        <w:t xml:space="preserve">This sign reversal is a well-documented property of multiplicative interaction models. As </w:t>
+      </w:r>
+      <w:proofErr w:type="spellStart"/>
+      <w:r>
+        <w:rPr>
+          <w:i/>
+          <w:iCs/>
+          <w:highlight w:val="yellow"/>
+        </w:rPr>
+        <w:t>Brambor</w:t>
+      </w:r>
+      <w:proofErr w:type="spellEnd"/>
+      <w:r>
+        <w:rPr>
+          <w:i/>
+          <w:iCs/>
+          <w:highlight w:val="yellow"/>
+        </w:rPr>
+        <w:t>, Clark, and Golder (2006, p. 72) emphasise, constitutive terms in interaction models should not be interpreted as unconditional marginal effects: the coefficient on AI in the interaction model captures the effect of AI adoption only when the moderating variable (ICT capacity) equals zero, not its average effect across all levels of ICT capacity. The change in coefficient magnitude and significance upon inclusion of the interaction term is 'almost certain' and 'should not be interpreted as a sign of multicollinearity' (</w:t>
+      </w:r>
+      <w:proofErr w:type="spellStart"/>
+      <w:r>
+        <w:rPr>
+          <w:i/>
+          <w:iCs/>
+          <w:highlight w:val="yellow"/>
+        </w:rPr>
+        <w:t>Brambor</w:t>
+      </w:r>
+      <w:proofErr w:type="spellEnd"/>
+      <w:r>
+        <w:rPr>
+          <w:i/>
+          <w:iCs/>
+          <w:highlight w:val="yellow"/>
+        </w:rPr>
+        <w:t xml:space="preserve"> et al., 2006, p. 70). </w:t>
+      </w:r>
+    </w:p>
+    <w:p>
+      <w:pPr>
+        <w:jc w:val="both"/>
+        <w:rPr>
+          <w:highlight w:val="yellow"/>
+        </w:rPr>
+      </w:pPr>
+      <w:r>
+        <w:rPr>
+          <w:i/>
+          <w:iCs/>
+          <w:highlight w:val="yellow"/>
+        </w:rPr>
+        <w:t xml:space="preserve">Substantively, the results are consistent with the task-based framework of Acemoglu and Restrepo (2022), which distinguishes between the displacement effect of automation (reducing wages) and the complementarity effect (raising productivity and wages). In the additive specification, the negative AI coefficient captures the unconditional average of these two opposing forces, which, on net, is negative — suggesting that displacement dominates on average across European sectors. In the interaction </w:t>
+      </w:r>
+      <w:r>
+        <w:rPr>
+          <w:i/>
+          <w:iCs/>
+          <w:highlight w:val="yellow"/>
+        </w:rPr>
+        <w:lastRenderedPageBreak/>
+        <w:t>specification, the near-zero AI coefficient at ICT = 0 suggests that AI adoption has negligible wage effects in sectors lacking digital infrastructure, while the negative interaction term indicates that the wage-reducing displacement effect intensifies in sectors with greater ICT capacity. This is economically intuitive: sectors that already possess substantial digital infrastructure are better positioned to implement AI-driven automation of tasks previously performed by workers, amplifying the displacement channel.</w:t>
+      </w:r>
+    </w:p>
+    <w:p>
+      <w:pPr>
+        <w:jc w:val="both"/>
+      </w:pPr>
+      <w:hyperlink r:id="rId7" w:history="1">
+        <w:r>
+          <w:rPr>
+            <w:rStyle w:val="Hyperlink"/>
+          </w:rPr>
+          <w:t>https://spia.uga.edu/faculty_pages/tyler.scott/teaching/PADP8130_Spring2017/readings/brambor.et.al.2006.pdf</w:t>
+        </w:r>
+      </w:hyperlink>
+    </w:p>
+    <w:p>
+      <w:pPr>
+        <w:jc w:val="both"/>
+      </w:pPr>
+      <w:r>
         <w:t>In the </w:t>
       </w:r>
       <w:r>
@@ -3024,7 +3087,13 @@
         <w:t>.</w:t>
       </w:r>
       <w:r>
-        <w:t xml:space="preserve"> This means that, when </w:t>
+        <w:t xml:space="preserve"> </w:t>
+      </w:r>
+      <w:r>
+        <w:t>As we discussed above, t</w:t>
+      </w:r>
+      <w:r>
+        <w:t xml:space="preserve">his means that, when </w:t>
       </w:r>
       <w:r>
         <w:t>we</w:t>
@@ -3042,13 +3111,61 @@
         <w:t>pp</w:t>
       </w:r>
       <w:r>
-        <w:t xml:space="preserve"> increase in AI adoption is associated with approximately a 0.7–1.3% lower wage level. </w:t>
+        <w:t xml:space="preserve"> increase in AI adoption is associated with approximately a 0.7–1.3% lower wage level.</w:t>
+      </w:r>
+      <w:r>
+        <w:t xml:space="preserve"> This aligns with Acemoglu and Restrepo findings </w:t>
+      </w:r>
+      <w:r>
+        <w:rPr>
+          <w:highlight w:val="yellow"/>
+        </w:rPr>
+        <w:t>[Acemoglu and Restrepo 2020]</w:t>
+      </w:r>
+      <w:r>
+        <w:t xml:space="preserve">, where they found </w:t>
+      </w:r>
+      <w:r>
+        <w:t>robust negative effects of automation on wages across US commuting zones: one more robot per thousand workers reduces wages by 0.42%, driven by the displacement effect dominating the productivity effect.</w:t>
+      </w:r>
+      <w:r>
+        <w:t xml:space="preserve"> Additionally, in another work Acemoglu </w:t>
+      </w:r>
+      <w:r>
+        <w:t> formalizes this as two opposing forces — a positive productivity effect and a negative displacement effect</w:t>
+      </w:r>
+      <w:r>
+        <w:t xml:space="preserve"> </w:t>
+      </w:r>
+      <w:r>
+        <w:rPr>
+          <w:highlight w:val="yellow"/>
+        </w:rPr>
+        <w:t>[Acemoglu 2024].</w:t>
+      </w:r>
+      <w:r>
+        <w:t xml:space="preserve"> He found that </w:t>
+      </w:r>
+      <w:r>
+        <w:t>"the displacement effect often dominates",</w:t>
+      </w:r>
+      <w:r>
+        <w:t xml:space="preserve"> meaning wage gains from AI will be limited.</w:t>
+      </w:r>
+      <w:r>
+        <w:t xml:space="preserve"> </w:t>
       </w:r>
       <w:r>
         <w:t>I</w:t>
       </w:r>
       <w:r>
-        <w:t>t likely reflects a composition effect</w:t>
+        <w:t xml:space="preserve">t </w:t>
+      </w:r>
+      <w:r>
+        <w:t xml:space="preserve">also </w:t>
+      </w:r>
+      <w:r>
+        <w:t>reflects a composition effect</w:t>
       </w:r>
       <w:r>
         <w:t>, where</w:t>
@@ -3071,35 +3188,115 @@
       <w:r>
         <w:t xml:space="preserve"> </w:t>
       </w:r>
-      <w:r>
-        <w:t>C</w:t>
-      </w:r>
-      <w:r>
-        <w:t xml:space="preserve">ritically, </w:t>
-      </w:r>
-      <w:r>
-        <w:t xml:space="preserve">once </w:t>
+    </w:p>
+    <w:p>
+      <w:pPr>
+        <w:jc w:val="both"/>
+      </w:pPr>
+      <w:r>
+        <w:t xml:space="preserve">On the other hand, ICT specialist variable is insignificant without interaction term. It means that </w:t>
+      </w:r>
+      <w:r>
+        <w:t>simply having more ICT specialists in a sector doesn</w:t>
+      </w:r>
+      <w:r>
+        <w:t>’</w:t>
+      </w:r>
+      <w:r>
+        <w:t xml:space="preserve">t independently predict higher wages once </w:t>
       </w:r>
       <w:r>
         <w:t>we</w:t>
       </w:r>
       <w:r>
-        <w:t xml:space="preserve"> add the interaction term, the AI coefficient flips to positive (0.004–0.012) but becomes insignificant. </w:t>
-      </w:r>
-      <w:r>
-        <w:t>I</w:t>
-      </w:r>
-      <w:r>
-        <w:t>n interaction models, the "main effect" of AI represents the effect when ICT = 0</w:t>
-      </w:r>
+        <w:t xml:space="preserve"> control for productivity</w:t>
+      </w:r>
+      <w:r>
+        <w:t xml:space="preserve"> </w:t>
+      </w:r>
+      <w:r>
+        <w:t>and fixed effects. The likely explanation is that ICT specialists are concentrated in sectors that already have high productivity (Sector J), so </w:t>
+      </w:r>
+      <w:proofErr w:type="spellStart"/>
+      <w:r>
+        <w:t>log_prdct_ij</w:t>
+      </w:r>
+      <w:proofErr w:type="spellEnd"/>
+      <w:r>
+        <w:t xml:space="preserve"> absorbs most of the wage variation that </w:t>
+      </w:r>
+      <w:proofErr w:type="spellStart"/>
+      <w:r>
+        <w:t>ICT_spec</w:t>
+      </w:r>
+      <w:proofErr w:type="spellEnd"/>
+      <w:r>
+        <w:t xml:space="preserve"> would otherwise explain.</w:t>
+      </w:r>
+      <w:r>
+        <w:t xml:space="preserve"> This statement finds prove in the </w:t>
+      </w:r>
+      <w:r>
+        <w:t>Working Paper No. 240, 2024</w:t>
+      </w:r>
+      <w:r>
+        <w:t xml:space="preserve"> by Barisic, Ghodsi and </w:t>
+      </w:r>
+      <w:proofErr w:type="spellStart"/>
+      <w:r>
+        <w:t>Stehrer</w:t>
+      </w:r>
+      <w:proofErr w:type="spellEnd"/>
       <w:r>
         <w:t xml:space="preserve">. </w:t>
       </w:r>
       <w:r>
-        <w:t>The meaningful quantity becomes the total marginal effect</w:t>
-      </w:r>
-      <w:r>
-        <w:t>.</w:t>
+        <w:rPr>
+          <w:b/>
+          <w:bCs/>
+        </w:rPr>
+        <w:t>T</w:t>
+      </w:r>
+      <w:r>
+        <w:t xml:space="preserve">heir cross-country sectoral analysis of 32 countries and 38 industries found that ICT capital investment has an insignificant effect on wages, while TFP (which captures productivity) shows a strongly significant positive association. </w:t>
+      </w:r>
+      <w:r>
+        <w:t xml:space="preserve">So, it means that </w:t>
+      </w:r>
+      <w:r>
+        <w:t>once productivity is controlled for, ICT capacity adds no independent explanatory power.</w:t>
+      </w:r>
+      <w:r>
+        <w:t xml:space="preserve"> [</w:t>
+      </w:r>
+      <w:r>
+        <w:rPr>
+          <w:highlight w:val="yellow"/>
+        </w:rPr>
+        <w:t xml:space="preserve">WP </w:t>
+      </w:r>
+      <w:r>
+        <w:rPr>
+          <w:highlight w:val="yellow"/>
+        </w:rPr>
+        <w:t xml:space="preserve">Barisic, Ghodsi and </w:t>
+      </w:r>
+      <w:proofErr w:type="spellStart"/>
+      <w:r>
+        <w:rPr>
+          <w:highlight w:val="yellow"/>
+        </w:rPr>
+        <w:t>Stehrer</w:t>
+      </w:r>
+      <w:proofErr w:type="spellEnd"/>
+      <w:r>
+        <w:rPr>
+          <w:highlight w:val="yellow"/>
+        </w:rPr>
+        <w:t xml:space="preserve"> 2024</w:t>
+      </w:r>
+      <w:r>
+        <w:t>]</w:t>
       </w:r>
     </w:p>
     <w:p>
@@ -3107,44 +3304,703 @@
         <w:jc w:val="both"/>
       </w:pPr>
       <w:r>
-        <w:t xml:space="preserve">On the other hand, ICT specialist variable is insignificant without interaction term. It means that </w:t>
-      </w:r>
-      <w:r>
-        <w:t>simply having more ICT specialists in a sector doesn</w:t>
+        <w:t xml:space="preserve">However, </w:t>
+      </w:r>
+      <w:proofErr w:type="spellStart"/>
+      <w:r>
+        <w:t>ICT_spec</w:t>
+      </w:r>
+      <w:proofErr w:type="spellEnd"/>
+      <w:r>
+        <w:t> becomes significant in the interaction models. This is because the interaction term decomposes the joint AI×ICT effect, allowing </w:t>
+      </w:r>
+      <w:proofErr w:type="spellStart"/>
+      <w:r>
+        <w:t>ict_spec_ij</w:t>
+      </w:r>
+      <w:proofErr w:type="spellEnd"/>
+      <w:r>
+        <w:t> to capture its "pure" (non-AI-related) contribution to wages more cleanly.</w:t>
+      </w:r>
+      <w:r>
+        <w:t xml:space="preserve"> [</w:t>
+      </w:r>
+      <w:proofErr w:type="spellStart"/>
+      <w:r>
+        <w:rPr>
+          <w:highlight w:val="yellow"/>
+        </w:rPr>
+        <w:t>Brambor</w:t>
+      </w:r>
+      <w:proofErr w:type="spellEnd"/>
+      <w:r>
+        <w:rPr>
+          <w:highlight w:val="yellow"/>
+        </w:rPr>
+        <w:t xml:space="preserve">, </w:t>
+      </w:r>
+      <w:r>
+        <w:rPr>
+          <w:highlight w:val="yellow"/>
+        </w:rPr>
+        <w:t>2006</w:t>
+      </w:r>
+      <w:r>
+        <w:t>]</w:t>
+      </w:r>
+      <w:r>
+        <w:t xml:space="preserve"> This suggests ICT specialists matter for wages primarily in conjunction with AI adoption, not independently.</w:t>
+      </w:r>
+    </w:p>
+    <w:p>
+      <w:pPr>
+        <w:jc w:val="both"/>
+      </w:pPr>
+      <w:r>
+        <w:t xml:space="preserve">Regarding the ICT training variable, it’s </w:t>
+      </w:r>
+      <w:r>
+        <w:t xml:space="preserve">significant at the 1% level in almost every specification (the only exception is the 2024 </w:t>
+      </w:r>
+      <w:r>
+        <w:t>model with no interaction</w:t>
+      </w:r>
+      <w:r>
+        <w:t xml:space="preserve">). This means that investment in workforce ICT training has a robust, independent positive effect on wages, regardless of whether </w:t>
+      </w:r>
+      <w:r>
+        <w:t>we</w:t>
+      </w:r>
+      <w:r>
+        <w:t xml:space="preserve"> account for AI interaction. A 1 pp increase in ICT training share is associated with approximately 0.6–1.0% higher wages.</w:t>
+      </w:r>
+      <w:r>
+        <w:t xml:space="preserve"> </w:t>
+      </w:r>
+      <w:r>
+        <w:t xml:space="preserve">Why does training matter more than specialists? Training represents broad-based upskilling of the existing workforce, which raises the marginal product of many workers simultaneously. </w:t>
+      </w:r>
+      <w:r>
+        <w:t>This also aligns with two studies findings:</w:t>
+      </w:r>
+      <w:r>
+        <w:t xml:space="preserve"> </w:t>
+      </w:r>
+      <w:r>
+        <w:t>“</w:t>
+      </w:r>
+      <w:r>
+        <w:t>Returns to ICT skills in European labour markets, trade unions and contractual cleavages</w:t>
+      </w:r>
+      <w:r>
+        <w:t xml:space="preserve">” by </w:t>
+      </w:r>
+      <w:proofErr w:type="spellStart"/>
+      <w:r>
+        <w:t>Tomelleri</w:t>
+      </w:r>
+      <w:proofErr w:type="spellEnd"/>
+      <w:r>
+        <w:t xml:space="preserve"> and </w:t>
+      </w:r>
+      <w:r>
+        <w:t xml:space="preserve">“Return to ICT Skills” by Falck, </w:t>
+      </w:r>
+      <w:proofErr w:type="spellStart"/>
+      <w:r>
+        <w:t>Heimisch</w:t>
+      </w:r>
+      <w:proofErr w:type="spellEnd"/>
+      <w:r>
+        <w:t xml:space="preserve"> and Wiederhold</w:t>
+      </w:r>
+      <w:r>
+        <w:t xml:space="preserve">. </w:t>
+      </w:r>
+      <w:r>
+        <w:t xml:space="preserve">In the </w:t>
+      </w:r>
+      <w:r>
+        <w:t xml:space="preserve">Falck, </w:t>
+      </w:r>
+      <w:proofErr w:type="spellStart"/>
+      <w:r>
+        <w:t>Heimisch</w:t>
+      </w:r>
+      <w:proofErr w:type="spellEnd"/>
+      <w:r>
+        <w:t>, and Wiederhold</w:t>
+      </w:r>
+      <w:r>
+        <w:t xml:space="preserve"> work returns </w:t>
+      </w:r>
+      <w:r>
+        <w:t xml:space="preserve">to ICT skills are approximately 8% per standard deviation increase across 19 countries. They explicitly identify the mechanism as learning-by-doing, </w:t>
+      </w:r>
+      <w:r>
+        <w:lastRenderedPageBreak/>
+        <w:t>which is broad-based upskilling rather than specialist selection.</w:t>
+      </w:r>
+      <w:r>
+        <w:t xml:space="preserve"> </w:t>
+      </w:r>
+      <w:r>
+        <w:rPr>
+          <w:highlight w:val="yellow"/>
+        </w:rPr>
+        <w:t>[</w:t>
+      </w:r>
+      <w:r>
+        <w:rPr>
+          <w:highlight w:val="yellow"/>
+        </w:rPr>
+        <w:t xml:space="preserve">Falck, </w:t>
+      </w:r>
+      <w:proofErr w:type="spellStart"/>
+      <w:r>
+        <w:rPr>
+          <w:highlight w:val="yellow"/>
+        </w:rPr>
+        <w:t>Heimisch</w:t>
+      </w:r>
+      <w:proofErr w:type="spellEnd"/>
+      <w:r>
+        <w:rPr>
+          <w:highlight w:val="yellow"/>
+        </w:rPr>
+        <w:t>, and Wiederhold</w:t>
+      </w:r>
+      <w:r>
+        <w:rPr>
+          <w:highlight w:val="yellow"/>
+        </w:rPr>
+        <w:t>. 2016</w:t>
+      </w:r>
+      <w:r>
+        <w:t>]</w:t>
+      </w:r>
+      <w:r>
+        <w:t xml:space="preserve">. </w:t>
+      </w:r>
+      <w:proofErr w:type="spellStart"/>
+      <w:r>
+        <w:t>Tomelleri</w:t>
+      </w:r>
+      <w:proofErr w:type="spellEnd"/>
+      <w:r>
+        <w:t xml:space="preserve">, </w:t>
+      </w:r>
+      <w:r>
+        <w:t>Cutuli</w:t>
+      </w:r>
+      <w:r>
+        <w:t xml:space="preserve"> and Signoretti in their work presented, that I</w:t>
+      </w:r>
+      <w:r>
+        <w:t>CT skills show a robust and positive correlation with hourly income. For each additional ICT skill used at work, there is a 2.6% increase in the hourly wage (p &lt; 0.001), stable across all model specifications.</w:t>
+      </w:r>
+      <w:r>
+        <w:t xml:space="preserve"> [</w:t>
+      </w:r>
+      <w:proofErr w:type="spellStart"/>
+      <w:r>
+        <w:rPr>
+          <w:highlight w:val="yellow"/>
+        </w:rPr>
+        <w:t>Tomelleri</w:t>
+      </w:r>
+      <w:proofErr w:type="spellEnd"/>
+      <w:r>
+        <w:rPr>
+          <w:highlight w:val="yellow"/>
+        </w:rPr>
+        <w:t>, 2025</w:t>
+      </w:r>
+      <w:r>
+        <w:t>]</w:t>
+      </w:r>
+    </w:p>
+    <w:p>
+      <w:r>
+        <w:t>The marginal effects table reveals the core finding for</w:t>
+      </w:r>
+      <w:r>
+        <w:t xml:space="preserve"> the</w:t>
+      </w:r>
+      <w:r>
+        <w:t xml:space="preserve"> research question. Taking 2021</w:t>
+      </w:r>
+      <w:r>
+        <w:t xml:space="preserve"> for the ICT specialist</w:t>
+      </w:r>
+      <w:r>
+        <w:t xml:space="preserve"> as an example:</w:t>
+      </w:r>
+      <w:r>
+        <w:t xml:space="preserve"> </w:t>
+      </w:r>
+    </w:p>
+    <w:p>
+      <w:pPr>
+        <w:ind w:left="720"/>
+      </w:pPr>
+      <w:r>
+        <w:t xml:space="preserve">Low </w:t>
+      </w:r>
+      <w:proofErr w:type="spellStart"/>
+      <w:r>
+        <w:t>ICT_spec</w:t>
+      </w:r>
+      <w:proofErr w:type="spellEnd"/>
+      <w:r>
+        <w:t xml:space="preserve"> (P25 = 12.46): ME = +0.0059</w:t>
+      </w:r>
+    </w:p>
+    <w:p>
+      <w:pPr>
+        <w:ind w:left="720"/>
+      </w:pPr>
+      <w:r>
+        <w:t xml:space="preserve">Median </w:t>
+      </w:r>
+      <w:proofErr w:type="spellStart"/>
+      <w:r>
+        <w:t>ICT_spec</w:t>
+      </w:r>
+      <w:proofErr w:type="spellEnd"/>
+      <w:r>
+        <w:t xml:space="preserve"> (P50 = 17.89): ME = +0.0048</w:t>
+      </w:r>
+    </w:p>
+    <w:p>
+      <w:pPr>
+        <w:ind w:left="720"/>
+      </w:pPr>
+      <w:r>
+        <w:t xml:space="preserve">High </w:t>
+      </w:r>
+      <w:proofErr w:type="spellStart"/>
+      <w:r>
+        <w:t>ICT_spec</w:t>
+      </w:r>
+      <w:proofErr w:type="spellEnd"/>
+      <w:r>
+        <w:t xml:space="preserve"> (P75 = 27.80): ME = +0.0028</w:t>
+      </w:r>
+    </w:p>
+    <w:p>
+      <w:pPr>
+        <w:jc w:val="both"/>
+      </w:pPr>
+      <w:r>
+        <w:t xml:space="preserve">The pattern is identical for ICT Training. This </w:t>
+      </w:r>
+      <w:r>
+        <w:t xml:space="preserve">means that at low ICT share (specialist or training), a 1 pp increase in AI adoption raises wages by 0.59%. At high ICT share (specialists or training), a 1 pp increase raises wages by only around 0.28%. </w:t>
+      </w:r>
+    </w:p>
+    <w:p>
+      <w:pPr>
+        <w:jc w:val="both"/>
+      </w:pPr>
+      <w:r>
+        <w:t>Another observation that t</w:t>
+      </w:r>
+      <w:r>
+        <w:t>he AI wage premium is cut roughly in half when moving from a low-tech to a high-tech environment. This is the</w:t>
+      </w:r>
+      <w:r>
+        <w:t xml:space="preserve"> </w:t>
+      </w:r>
+      <w:r>
+        <w:t xml:space="preserve">diminishing returns effect: sectors that already have strong digital infrastructure benefit less from additional AI because their processes are already optimized. </w:t>
+      </w:r>
+      <w:r>
+        <w:t xml:space="preserve">This aligns with Acemoglu 2024 work, where the author showed </w:t>
+      </w:r>
+      <w:r>
+        <w:t>that </w:t>
+      </w:r>
+      <w:r>
+        <w:t>"task complementarities" </w:t>
+      </w:r>
+      <w:r>
+        <w:t>impose diminishing returns: once a sector has already automated its easy tasks, additional AI yields smaller marginal gains, and the displacement effect increasingly dominates</w:t>
+      </w:r>
+      <w:r>
+        <w:t>. [</w:t>
+      </w:r>
+      <w:proofErr w:type="spellStart"/>
+      <w:r>
+        <w:rPr>
+          <w:highlight w:val="yellow"/>
+        </w:rPr>
+        <w:t>Acemogl</w:t>
+      </w:r>
+      <w:proofErr w:type="spellEnd"/>
+      <w:r>
+        <w:rPr>
+          <w:highlight w:val="yellow"/>
+        </w:rPr>
+        <w:t xml:space="preserve"> 2024</w:t>
+      </w:r>
+      <w:r>
+        <w:t xml:space="preserve">] </w:t>
+      </w:r>
+      <w:r>
+        <w:t xml:space="preserve">The interaction term </w:t>
+      </w:r>
+      <w:r>
+        <w:t>(</w:t>
+      </w:r>
+      <w:r>
+        <w:t>-0.020</w:t>
+      </w:r>
+      <w:r>
+        <w:t>***</w:t>
+      </w:r>
+      <w:r>
+        <w:t xml:space="preserve"> </w:t>
+      </w:r>
+      <w:r>
+        <w:t>)</w:t>
+      </w:r>
+      <w:r>
+        <w:t xml:space="preserve"> </w:t>
+      </w:r>
+      <w:r>
+        <w:t xml:space="preserve">is the mathematical driver </w:t>
+      </w:r>
+      <w:r>
+        <w:t>and is</w:t>
+      </w:r>
+      <w:r>
+        <w:t xml:space="preserve"> significant at the 1% level in every year</w:t>
+      </w:r>
+      <w:r>
+        <w:t>, c</w:t>
+      </w:r>
+      <w:r>
+        <w:t>onfirming this is not random noise.</w:t>
+      </w:r>
+    </w:p>
+    <w:p>
+      <w:pPr>
+        <w:jc w:val="both"/>
+      </w:pPr>
+      <w:r>
+        <w:t xml:space="preserve">Additionally, two patterns could be reveal from the marginal effects. </w:t>
+      </w:r>
+      <w:r>
+        <w:t xml:space="preserve">The first one is the spike in 2022 year that </w:t>
+      </w:r>
+      <w:r>
+        <w:t xml:space="preserve">reflect the inflation shock. </w:t>
+      </w:r>
+      <w:r>
+        <w:t>In 2022</w:t>
+      </w:r>
+      <w:r>
+        <w:rPr>
+          <w:bCs/>
+        </w:rPr>
+        <w:t>, nominal wages spiked</w:t>
+      </w:r>
+      <w:r>
+        <w:t xml:space="preserve"> across all sectors simultaneously (nominal wage growth was </w:t>
+      </w:r>
+      <w:r>
+        <w:t xml:space="preserve">around </w:t>
+      </w:r>
+      <w:r>
+        <w:t>4.8% on average in the EU)</w:t>
+      </w:r>
+      <w:r>
+        <w:t xml:space="preserve"> [</w:t>
+      </w:r>
+      <w:r>
+        <w:rPr>
+          <w:highlight w:val="yellow"/>
+        </w:rPr>
+        <w:t>Soc. EU</w:t>
+      </w:r>
+      <w:r>
+        <w:t xml:space="preserve">]. </w:t>
+      </w:r>
+      <w:r>
+        <w:t>Sectors with AI adoption saw their nominal wages rise sharply too</w:t>
+      </w:r>
+      <w:r>
+        <w:t xml:space="preserve">, </w:t>
+      </w:r>
+      <w:r>
+        <w:t>but this was inflation-driven, not AI-driven</w:t>
+      </w:r>
+      <w:r>
+        <w:t xml:space="preserve">. </w:t>
+      </w:r>
+    </w:p>
+    <w:p>
+      <w:pPr>
+        <w:jc w:val="both"/>
+      </w:pPr>
+      <w:r>
+        <w:t xml:space="preserve">Second patter is decline in ICT training. The training track shows a smoother, steadier decline without the 2022 spike. This makes sense because training is a slower, more gradual process than hiring specialists.  Its effects don't spike with technology hype. The convergence toward zero at </w:t>
+      </w:r>
+      <w:r>
+        <w:t>h</w:t>
+      </w:r>
+      <w:r>
+        <w:t xml:space="preserve">igh ICT in 2024 (0.0002 for specialists, 0.0006 for training) is particularly striking: by 2024, AI essentially provides no additional wage premium in already digitally mature sectors. </w:t>
+      </w:r>
+      <w:r>
+        <w:rPr>
+          <w:highlight w:val="yellow"/>
+        </w:rPr>
+        <w:t>[</w:t>
+      </w:r>
+      <w:proofErr w:type="spellStart"/>
+      <w:r>
+        <w:rPr>
+          <w:b/>
+          <w:bCs/>
+          <w:highlight w:val="yellow"/>
+        </w:rPr>
+        <w:t>Kording</w:t>
+      </w:r>
+      <w:proofErr w:type="spellEnd"/>
+      <w:r>
+        <w:rPr>
+          <w:b/>
+          <w:bCs/>
+          <w:highlight w:val="yellow"/>
+        </w:rPr>
+        <w:t xml:space="preserve">, </w:t>
+      </w:r>
+      <w:r>
+        <w:rPr>
+          <w:b/>
+          <w:bCs/>
+          <w:highlight w:val="yellow"/>
+        </w:rPr>
+        <w:t>Marinescu</w:t>
+      </w:r>
+      <w:r>
+        <w:rPr>
+          <w:b/>
+          <w:bCs/>
+          <w:highlight w:val="yellow"/>
+        </w:rPr>
+        <w:t xml:space="preserve"> 2025??? recheck</w:t>
+      </w:r>
+      <w:r>
+        <w:rPr>
+          <w:highlight w:val="yellow"/>
+        </w:rPr>
+        <w:t>]</w:t>
+      </w:r>
+    </w:p>
+    <w:p>
+      <w:pPr>
+        <w:rPr>
+          <w:highlight w:val="yellow"/>
+        </w:rPr>
+      </w:pPr>
+      <w:r>
+        <w:rPr>
+          <w:highlight w:val="yellow"/>
+        </w:rPr>
+        <w:t xml:space="preserve">Limitations: </w:t>
+      </w:r>
+    </w:p>
+    <w:p>
+      <w:pPr>
+        <w:rPr>
+          <w:highlight w:val="yellow"/>
+        </w:rPr>
+      </w:pPr>
+      <w:r>
+        <w:rPr>
+          <w:highlight w:val="yellow"/>
+        </w:rPr>
+        <w:t>1.too few observations for NL (excluded for 2023)</w:t>
+      </w:r>
+    </w:p>
+    <w:p>
+      <w:pPr>
+        <w:rPr>
+          <w:highlight w:val="yellow"/>
+        </w:rPr>
+      </w:pPr>
+      <w:r>
+        <w:rPr>
+          <w:highlight w:val="yellow"/>
+        </w:rPr>
+        <w:t>2. VIF for </w:t>
+      </w:r>
+      <w:proofErr w:type="spellStart"/>
+      <w:r>
+        <w:rPr>
+          <w:highlight w:val="yellow"/>
+        </w:rPr>
+        <w:t>ai_ij</w:t>
+      </w:r>
+      <w:proofErr w:type="spellEnd"/>
+      <w:r>
+        <w:rPr>
+          <w:highlight w:val="yellow"/>
+        </w:rPr>
+        <w:t> and I(</w:t>
+      </w:r>
+      <w:proofErr w:type="spellStart"/>
+      <w:r>
+        <w:rPr>
+          <w:highlight w:val="yellow"/>
+        </w:rPr>
+        <w:t>ai_ij</w:t>
+      </w:r>
+      <w:proofErr w:type="spellEnd"/>
+      <w:r>
+        <w:rPr>
+          <w:highlight w:val="yellow"/>
+        </w:rPr>
+        <w:t xml:space="preserve"> * </w:t>
+      </w:r>
+      <w:proofErr w:type="spellStart"/>
+      <w:r>
+        <w:rPr>
+          <w:highlight w:val="yellow"/>
+        </w:rPr>
+        <w:t>ict_spec_ij</w:t>
+      </w:r>
+      <w:proofErr w:type="spellEnd"/>
+      <w:r>
+        <w:rPr>
+          <w:highlight w:val="yellow"/>
+        </w:rPr>
+        <w:t xml:space="preserve">) reaches 39–82 in the interaction models (AI and ICT variables are correlated) </w:t>
+      </w:r>
+    </w:p>
+    <w:p>
+      <w:pPr>
+        <w:rPr>
+          <w:highlight w:val="yellow"/>
+        </w:rPr>
+      </w:pPr>
+      <w:r>
+        <w:rPr>
+          <w:highlight w:val="yellow"/>
+        </w:rPr>
+        <w:t xml:space="preserve">3. All models fail the RESET test </w:t>
+      </w:r>
+    </w:p>
+    <w:p>
+      <w:pPr>
+        <w:rPr>
+          <w:highlight w:val="yellow"/>
+        </w:rPr>
+      </w:pPr>
+      <w:r>
+        <w:rPr>
+          <w:highlight w:val="yellow"/>
+        </w:rPr>
+        <w:t xml:space="preserve">4. declining marginal effects (AI become commodities, since more firms adopt it? Or, measurement issue (Eurostat survey questions may change?) </w:t>
+      </w:r>
+    </w:p>
+    <w:p>
+      <w:r>
+        <w:rPr>
+          <w:highlight w:val="yellow"/>
+        </w:rPr>
+        <w:t>Need to describe additional literature regarding the findings. Resources are found.</w:t>
+      </w:r>
+      <w:r>
+        <w:t xml:space="preserve"> </w:t>
+      </w:r>
+    </w:p>
+    <w:p>
+      <w:pPr>
+        <w:jc w:val="both"/>
+      </w:pPr>
+      <w:r>
+        <w:rPr>
+          <w:highlight w:val="yellow"/>
+        </w:rPr>
+        <w:t xml:space="preserve">Tables 2021-2024 </w:t>
+      </w:r>
+      <w:r>
+        <w:rPr>
+          <w:highlight w:val="yellow"/>
+        </w:rPr>
+        <w:t>wage growth</w:t>
+      </w:r>
+      <w:r>
+        <w:t xml:space="preserve"> </w:t>
+      </w:r>
+    </w:p>
+    <w:p>
+      <w:pPr>
+        <w:jc w:val="both"/>
+      </w:pPr>
+      <w:r>
+        <w:lastRenderedPageBreak/>
+        <w:t>The analysis of year-over-year wage growth reveals a fundamentally different dynamic compared to the structural wage level models. While the cross-sectional level models  demonstrated a positive AI wage premium that diminishes with higher ICT capacity (</w:t>
+      </w:r>
+      <w:r>
+        <w:rPr>
+          <w:highlight w:val="yellow"/>
+        </w:rPr>
+        <w:t xml:space="preserve">"saturation" effect?, </w:t>
+      </w:r>
+      <w:proofErr w:type="spellStart"/>
+      <w:r>
+        <w:rPr>
+          <w:highlight w:val="yellow"/>
+        </w:rPr>
+        <w:t>lit.reference</w:t>
+      </w:r>
+      <w:proofErr w:type="spellEnd"/>
+      <w:r>
+        <w:t xml:space="preserve"> </w:t>
+      </w:r>
+      <w:r>
+        <w:t>), the wage growth models for 2021–2023 indicate that this mechanism doesn</w:t>
       </w:r>
       <w:r>
         <w:t>’</w:t>
       </w:r>
       <w:r>
-        <w:t xml:space="preserve">t independently predict higher wages once </w:t>
-      </w:r>
-      <w:r>
-        <w:t>we</w:t>
-      </w:r>
-      <w:r>
-        <w:t xml:space="preserve"> control for productivity</w:t>
+        <w:t xml:space="preserve">t drive short-term wage dynamics. </w:t>
+      </w:r>
+      <w:r>
+        <w:t>During the period of 2021-2022</w:t>
       </w:r>
       <w:r>
         <w:t xml:space="preserve"> </w:t>
       </w:r>
       <w:r>
-        <w:t>and fixed effects. The likely explanation is that ICT specialists are concentrated in sectors that already have high productivity (Sector J), so </w:t>
-      </w:r>
-      <w:proofErr w:type="spellStart"/>
-      <w:r>
-        <w:t>log_prdct_ij</w:t>
-      </w:r>
-      <w:proofErr w:type="spellEnd"/>
-      <w:r>
-        <w:t xml:space="preserve"> absorbs most of the wage variation that </w:t>
-      </w:r>
-      <w:proofErr w:type="spellStart"/>
-      <w:r>
-        <w:t>ICT_spec</w:t>
-      </w:r>
-      <w:proofErr w:type="spellEnd"/>
-      <w:r>
-        <w:t xml:space="preserve"> would otherwise explain.</w:t>
+        <w:rPr>
+          <w:highlight w:val="yellow"/>
+        </w:rPr>
+        <w:t>(high-inflation?),</w:t>
+      </w:r>
+      <w:r>
+        <w:t xml:space="preserve"> real wage growth was almost entirely determined by macroeconomic factors (GDP and HICP), which explained up to 57% of the variance. The short-term structural effects of AI adoption were statistically invisible</w:t>
+      </w:r>
+      <w:r>
+        <w:t xml:space="preserve">, insignificant </w:t>
+      </w:r>
+      <w:r>
+        <w:t xml:space="preserve"> during this period of extreme macro volatility.</w:t>
+      </w:r>
+      <w:r>
+        <w:t xml:space="preserve"> </w:t>
+      </w:r>
+      <w:r>
+        <w:t>In contrast, as inflation stabilized in 2023, the explanatory power of the model dropped to 38%, and the inflation variable lost its statistical significance</w:t>
+      </w:r>
+      <w:r>
+        <w:t xml:space="preserve">. </w:t>
       </w:r>
     </w:p>
     <w:p>
@@ -3152,23 +4008,34 @@
         <w:jc w:val="both"/>
       </w:pPr>
       <w:r>
-        <w:t xml:space="preserve">However, </w:t>
-      </w:r>
-      <w:proofErr w:type="spellStart"/>
-      <w:r>
-        <w:t>ICT_spec</w:t>
-      </w:r>
-      <w:proofErr w:type="spellEnd"/>
-      <w:r>
-        <w:t> becomes significant in the interaction models. This is because the interaction term decomposes the joint AI×ICT effect, allowing </w:t>
-      </w:r>
-      <w:proofErr w:type="spellStart"/>
-      <w:r>
-        <w:t>ict_spec_ij</w:t>
-      </w:r>
-      <w:proofErr w:type="spellEnd"/>
-      <w:r>
-        <w:t> to capture its "pure" (non-AI-related) contribution to wages more cleanly. This suggests ICT specialists matter for wages primarily in conjunction with AI adoption, not independently.</w:t>
+        <w:t xml:space="preserve">For the years 2021-2022 interaction term was insignificant. </w:t>
+      </w:r>
+      <w:r>
+        <w:t>In 2023, while the interaction term is marginally significant, the base effect of AI becomes negative. This contrast confirms that the  mechanism is a long-term structural feature of the labo</w:t>
+      </w:r>
+      <w:r>
+        <w:t>u</w:t>
+      </w:r>
+      <w:r>
+        <w:t>r market</w:t>
+      </w:r>
+      <w:r>
+        <w:t xml:space="preserve">, </w:t>
+      </w:r>
+      <w:r>
+        <w:t>determining absolute wage hierarchies between sectors</w:t>
+      </w:r>
+      <w:r>
+        <w:t xml:space="preserve">, </w:t>
+      </w:r>
+      <w:r>
+        <w:t>rather than a driver of annual wage adjustments. High-tech sectors maintain their wage premium, but they don</w:t>
+      </w:r>
+      <w:r>
+        <w:t>’</w:t>
+      </w:r>
+      <w:r>
+        <w:t>t necessarily experience faster year-over-year wage growth than lower-tech sectors, particularly during periods of high volatility.</w:t>
       </w:r>
     </w:p>
     <w:p>
@@ -3176,398 +4043,12 @@
         <w:jc w:val="both"/>
       </w:pPr>
       <w:r>
-        <w:t xml:space="preserve">Regarding the ICT training variable, it’s </w:t>
-      </w:r>
-      <w:r>
-        <w:t xml:space="preserve">significant at the 1% level in almost every specification (the only exception is the 2024 </w:t>
-      </w:r>
-      <w:r>
-        <w:t>model with no interaction</w:t>
-      </w:r>
-      <w:r>
-        <w:t xml:space="preserve">). This means that investment in workforce ICT training has a robust, independent positive effect on wages, regardless of whether </w:t>
-      </w:r>
-      <w:r>
-        <w:t>we</w:t>
-      </w:r>
-      <w:r>
-        <w:t xml:space="preserve"> account for AI interaction. A 1 pp increase in ICT training share is associated with approximately 0.6–1.0% higher wages.</w:t>
-      </w:r>
-      <w:r>
-        <w:t xml:space="preserve"> </w:t>
-      </w:r>
-      <w:r>
-        <w:t xml:space="preserve">Why does training matter more than specialists? Training represents broad-based upskilling of the existing workforce, which raises the marginal product of many workers simultaneously. </w:t>
-      </w:r>
-    </w:p>
-    <w:p>
-      <w:r>
-        <w:t>The marginal effects table reveals the core finding for</w:t>
-      </w:r>
-      <w:r>
-        <w:t xml:space="preserve"> the</w:t>
-      </w:r>
-      <w:r>
-        <w:t xml:space="preserve"> research question. Taking 2021</w:t>
-      </w:r>
-      <w:r>
-        <w:t xml:space="preserve"> for the ICT specialist</w:t>
-      </w:r>
-      <w:r>
-        <w:t xml:space="preserve"> as an example:</w:t>
-      </w:r>
-    </w:p>
-    <w:p>
-      <w:pPr>
-        <w:ind w:left="720"/>
-      </w:pPr>
-      <w:r>
-        <w:t xml:space="preserve">Low </w:t>
-      </w:r>
-      <w:proofErr w:type="spellStart"/>
-      <w:r>
-        <w:t>ICT_spec</w:t>
-      </w:r>
-      <w:proofErr w:type="spellEnd"/>
-      <w:r>
-        <w:t xml:space="preserve"> (P25 = 12.46): ME = +0.0059</w:t>
-      </w:r>
-    </w:p>
-    <w:p>
-      <w:pPr>
-        <w:ind w:left="720"/>
-      </w:pPr>
-      <w:r>
-        <w:t xml:space="preserve">Median </w:t>
-      </w:r>
-      <w:proofErr w:type="spellStart"/>
-      <w:r>
-        <w:t>ICT_spec</w:t>
-      </w:r>
-      <w:proofErr w:type="spellEnd"/>
-      <w:r>
-        <w:t xml:space="preserve"> (P50 = 17.89): ME = +0.0048</w:t>
-      </w:r>
-    </w:p>
-    <w:p>
-      <w:pPr>
-        <w:ind w:left="720"/>
-      </w:pPr>
-      <w:r>
-        <w:t xml:space="preserve">High </w:t>
-      </w:r>
-      <w:proofErr w:type="spellStart"/>
-      <w:r>
-        <w:t>ICT_spec</w:t>
-      </w:r>
-      <w:proofErr w:type="spellEnd"/>
-      <w:r>
-        <w:t xml:space="preserve"> (P75 = 27.80): ME = +0.0028</w:t>
-      </w:r>
-    </w:p>
-    <w:p>
-      <w:pPr>
-        <w:jc w:val="both"/>
-      </w:pPr>
-      <w:r>
-        <w:t xml:space="preserve">The pattern is identical for ICT Training. This </w:t>
-      </w:r>
-      <w:r>
-        <w:t xml:space="preserve">means that at low ICT share (specialist or training), a 1 pp increase in AI adoption raises wages by 0.59%. At high ICT share (specialists or training), a 1 pp increase raises wages by only around 0.28%. </w:t>
-      </w:r>
-    </w:p>
-    <w:p>
-      <w:pPr>
-        <w:jc w:val="both"/>
-      </w:pPr>
-      <w:r>
-        <w:t>Another observation that t</w:t>
-      </w:r>
-      <w:r>
-        <w:t xml:space="preserve">he AI wage premium is cut roughly in half when moving from a low-tech to a high-tech environment. This is the saturation/diminishing returns effect: sectors that already have strong digital infrastructure benefit less from additional AI because their processes are already </w:t>
-      </w:r>
-      <w:r>
-        <w:lastRenderedPageBreak/>
-        <w:t xml:space="preserve">optimized. </w:t>
-      </w:r>
-      <w:r>
-        <w:t xml:space="preserve">The interaction term (−0.000***) is the mathematical driver </w:t>
-      </w:r>
-      <w:r>
-        <w:t>and is</w:t>
-      </w:r>
-      <w:r>
-        <w:t xml:space="preserve"> significant at the 1% level in every year</w:t>
-      </w:r>
-      <w:r>
-        <w:t>, c</w:t>
-      </w:r>
-      <w:r>
-        <w:t>onfirming this is not random noise.</w:t>
-      </w:r>
-    </w:p>
-    <w:p>
-      <w:pPr>
-        <w:jc w:val="both"/>
-      </w:pPr>
-      <w:r>
-        <w:t xml:space="preserve">Additionally, two patterns could be reveal from the marginal effects. </w:t>
-      </w:r>
-      <w:r>
-        <w:t xml:space="preserve">The first one is the spike in 2022 year that likely reflects the initial excitement and investment wave around AI (2022 was the year ChatGPT launched in late November, and many firms were already scaling classical AI/ML projects). Firms that adopted AI early reaped the largest productivity-to-wage pass-through. By 2023–2024, as AI became more widespread, the premium blurred. Second patter is decline in ICT training. The training track shows a smoother, steadier decline without the 2022 spike. This makes sense because training is a slower, more gradual process than hiring specialists.  Its effects don't spike with technology hype. The convergence toward zero at High ICT in 2024 (0.0002 for specialists, 0.0006 for training) is particularly striking: by 2024, AI essentially provides no additional wage premium in already digitally mature sectors. </w:t>
-      </w:r>
-    </w:p>
-    <w:p>
-      <w:pPr>
-        <w:rPr>
-          <w:highlight w:val="yellow"/>
-        </w:rPr>
-      </w:pPr>
-      <w:r>
-        <w:rPr>
-          <w:highlight w:val="yellow"/>
-        </w:rPr>
-        <w:t xml:space="preserve">Limitations: </w:t>
-      </w:r>
-    </w:p>
-    <w:p>
-      <w:pPr>
-        <w:rPr>
-          <w:highlight w:val="yellow"/>
-        </w:rPr>
-      </w:pPr>
-      <w:r>
-        <w:rPr>
-          <w:highlight w:val="yellow"/>
-        </w:rPr>
-        <w:t>1.too few observations for NL (excluded for 2023)</w:t>
-      </w:r>
-    </w:p>
-    <w:p>
-      <w:pPr>
-        <w:rPr>
-          <w:highlight w:val="yellow"/>
-        </w:rPr>
-      </w:pPr>
-      <w:r>
-        <w:rPr>
-          <w:highlight w:val="yellow"/>
-        </w:rPr>
-        <w:t>2. VIF for </w:t>
-      </w:r>
-      <w:proofErr w:type="spellStart"/>
-      <w:r>
-        <w:rPr>
-          <w:highlight w:val="yellow"/>
-        </w:rPr>
-        <w:t>ai_ij</w:t>
-      </w:r>
-      <w:proofErr w:type="spellEnd"/>
-      <w:r>
-        <w:rPr>
-          <w:highlight w:val="yellow"/>
-        </w:rPr>
-        <w:t> and I(</w:t>
-      </w:r>
-      <w:proofErr w:type="spellStart"/>
-      <w:r>
-        <w:rPr>
-          <w:highlight w:val="yellow"/>
-        </w:rPr>
-        <w:t>ai_ij</w:t>
-      </w:r>
-      <w:proofErr w:type="spellEnd"/>
-      <w:r>
-        <w:rPr>
-          <w:highlight w:val="yellow"/>
-        </w:rPr>
-        <w:t xml:space="preserve"> * </w:t>
-      </w:r>
-      <w:proofErr w:type="spellStart"/>
-      <w:r>
-        <w:rPr>
-          <w:highlight w:val="yellow"/>
-        </w:rPr>
-        <w:t>ict_spec_ij</w:t>
-      </w:r>
-      <w:proofErr w:type="spellEnd"/>
-      <w:r>
-        <w:rPr>
-          <w:highlight w:val="yellow"/>
-        </w:rPr>
-        <w:t xml:space="preserve">) reaches 39–82 in the interaction models (AI and ICT variables are correlated) </w:t>
-      </w:r>
-    </w:p>
-    <w:p>
-      <w:pPr>
-        <w:rPr>
-          <w:highlight w:val="yellow"/>
-        </w:rPr>
-      </w:pPr>
-      <w:r>
-        <w:rPr>
-          <w:highlight w:val="yellow"/>
-        </w:rPr>
-        <w:t xml:space="preserve">3. All models fail the RESET test </w:t>
-      </w:r>
-    </w:p>
-    <w:p>
-      <w:pPr>
-        <w:rPr>
-          <w:highlight w:val="yellow"/>
-        </w:rPr>
-      </w:pPr>
-      <w:r>
-        <w:rPr>
-          <w:highlight w:val="yellow"/>
-        </w:rPr>
-        <w:t xml:space="preserve">4. declining marginal effects (AI become commodities, since more firms adopt it? Or, measurement issue (Eurostat survey questions may change?) </w:t>
-      </w:r>
-    </w:p>
-    <w:p>
-      <w:r>
-        <w:rPr>
-          <w:highlight w:val="yellow"/>
-        </w:rPr>
-        <w:t>Need to describe additional literature regarding the findings. Resources are found.</w:t>
-      </w:r>
-      <w:r>
-        <w:t xml:space="preserve"> </w:t>
-      </w:r>
-    </w:p>
-    <w:p>
-      <w:pPr>
-        <w:jc w:val="both"/>
-      </w:pPr>
-      <w:r>
-        <w:rPr>
-          <w:highlight w:val="yellow"/>
-        </w:rPr>
-        <w:t xml:space="preserve">Tables 2021-2024 </w:t>
-      </w:r>
-      <w:r>
-        <w:rPr>
-          <w:highlight w:val="yellow"/>
-        </w:rPr>
-        <w:t>wage growth</w:t>
-      </w:r>
-      <w:r>
-        <w:t xml:space="preserve"> </w:t>
-      </w:r>
-    </w:p>
-    <w:p>
-      <w:pPr>
-        <w:jc w:val="both"/>
-      </w:pPr>
-      <w:r>
-        <w:t>The analysis of year-over-year wage growth reveals a fundamentally different dynamic compared to the structural wage level models. While the cross-sectional level models  demonstrated a positive AI wage premium that diminishes with higher ICT capacity (</w:t>
-      </w:r>
-      <w:r>
-        <w:rPr>
-          <w:highlight w:val="yellow"/>
-        </w:rPr>
-        <w:t xml:space="preserve">"saturation" effect?, </w:t>
-      </w:r>
-      <w:proofErr w:type="spellStart"/>
-      <w:r>
-        <w:rPr>
-          <w:highlight w:val="yellow"/>
-        </w:rPr>
-        <w:t>lit.reference</w:t>
-      </w:r>
-      <w:proofErr w:type="spellEnd"/>
-      <w:r>
-        <w:t xml:space="preserve"> </w:t>
-      </w:r>
-      <w:r>
-        <w:t>), the wage growth models for 2021–2023 indicate that this mechanism doesn</w:t>
-      </w:r>
-      <w:r>
-        <w:t>’</w:t>
-      </w:r>
-      <w:r>
-        <w:t xml:space="preserve">t drive short-term wage dynamics. </w:t>
-      </w:r>
-      <w:r>
-        <w:t>During the period of 2021-2022</w:t>
-      </w:r>
-      <w:r>
-        <w:t xml:space="preserve"> </w:t>
-      </w:r>
-      <w:r>
-        <w:rPr>
-          <w:highlight w:val="yellow"/>
-        </w:rPr>
-        <w:t>(high-inflation?),</w:t>
-      </w:r>
-      <w:r>
-        <w:t xml:space="preserve"> real wage growth was almost entirely determined by macroeconomic factors (GDP and HICP), which explained up to 57% of the variance. The short-term structural effects of AI adoption were statistically invisible</w:t>
-      </w:r>
-      <w:r>
-        <w:t xml:space="preserve">, insignificant </w:t>
-      </w:r>
-      <w:r>
-        <w:t xml:space="preserve"> during this period of extreme macro volatility.</w:t>
-      </w:r>
-      <w:r>
-        <w:t xml:space="preserve"> </w:t>
-      </w:r>
-      <w:r>
-        <w:t>In contrast, as inflation stabilized in 2023, the explanatory power of the model dropped to 38%, and the inflation variable lost its statistical significance</w:t>
-      </w:r>
-      <w:r>
-        <w:t xml:space="preserve">. </w:t>
-      </w:r>
-    </w:p>
-    <w:p>
-      <w:pPr>
-        <w:jc w:val="both"/>
-      </w:pPr>
-      <w:r>
-        <w:t xml:space="preserve">For the years 2021-2022 interaction term was insignificant. </w:t>
-      </w:r>
-      <w:r>
-        <w:t>In 2023, while the interaction term is marginally significant, the base effect of AI becomes negative. This contrast confirms that the  mechanism is a long-term structural feature of the labo</w:t>
-      </w:r>
-      <w:r>
-        <w:t>u</w:t>
-      </w:r>
-      <w:r>
-        <w:t>r market</w:t>
-      </w:r>
-      <w:r>
-        <w:t xml:space="preserve">, </w:t>
-      </w:r>
-      <w:r>
-        <w:t>determining absolute wage hierarchies between sectors</w:t>
-      </w:r>
-      <w:r>
-        <w:t xml:space="preserve">, </w:t>
-      </w:r>
-      <w:r>
-        <w:t>rather than a driver of annual wage adjustments. High-tech sectors maintain their wage premium, but they don</w:t>
-      </w:r>
-      <w:r>
-        <w:t>’</w:t>
-      </w:r>
-      <w:r>
-        <w:t>t necessarily experience faster year-over-year wage growth than lower-tech sectors, particularly during periods of high volatility.</w:t>
-      </w:r>
-    </w:p>
-    <w:p>
-      <w:pPr>
-        <w:jc w:val="both"/>
-      </w:pPr>
-      <w:r>
         <w:t>A distinct negative relationship between AI adoption and real wage growth emerges in the 2023 specification. In the baseline models without interaction terms, the AI coefficient is effectively zero for 2021 and 2022. However, in the 2023 interaction model (Model 38), the main effect of AI adoption drops to -0.003 and becomes statistically significant (p &lt; 0.05).</w:t>
       </w:r>
     </w:p>
     <w:p>
       <w:r>
-        <w:t>Wage growth</w:t>
-      </w:r>
-      <w:r>
-        <w:t xml:space="preserve"> models per year </w:t>
+        <w:t xml:space="preserve">Wage growth models per year </w:t>
       </w:r>
     </w:p>
     <w:tbl>
@@ -3589,7 +4070,6 @@
           </w:tcPr>
           <w:p>
             <w:r>
-              <w:lastRenderedPageBreak/>
               <w:t xml:space="preserve">Year </w:t>
             </w:r>
           </w:p>
@@ -3883,19 +4363,7 @@
           </w:tcPr>
           <w:p>
             <w:r>
-              <w:t>-0.</w:t>
-            </w:r>
-            <w:r>
-              <w:t>162e-0</w:t>
-            </w:r>
-            <w:r>
-              <w:t>5 (0.</w:t>
-            </w:r>
-            <w:r>
-              <w:t>162e-0</w:t>
-            </w:r>
-            <w:r>
-              <w:t>4)</w:t>
+              <w:t>-0.162e-05 (0.162e-04)</w:t>
             </w:r>
           </w:p>
         </w:tc>
@@ -3994,10 +4462,7 @@
               <w:t>0.00</w:t>
             </w:r>
             <w:r>
-              <w:t>3</w:t>
-            </w:r>
-            <w:r>
-              <w:t xml:space="preserve"> (</w:t>
+              <w:t>3 (</w:t>
             </w:r>
             <w:r>
               <w:t>0.001</w:t>
@@ -4463,10 +4928,7 @@
               <w:t>0.00</w:t>
             </w:r>
             <w:r>
-              <w:t>0</w:t>
-            </w:r>
-            <w:r>
-              <w:t xml:space="preserve"> (</w:t>
+              <w:t>0 (</w:t>
             </w:r>
             <w:r>
               <w:t>0.001</w:t>
@@ -4488,10 +4950,7 @@
               <w:t>0.00</w:t>
             </w:r>
             <w:r>
-              <w:t>0</w:t>
-            </w:r>
-            <w:r>
-              <w:t xml:space="preserve"> (</w:t>
+              <w:t>0 (</w:t>
             </w:r>
             <w:r>
               <w:t>0.001</w:t>
@@ -4537,19 +4996,13 @@
               <w:t>0.00</w:t>
             </w:r>
             <w:r>
-              <w:t>2</w:t>
-            </w:r>
-            <w:r>
-              <w:t xml:space="preserve"> (</w:t>
+              <w:t>2 (</w:t>
             </w:r>
             <w:r>
               <w:t>0.00</w:t>
             </w:r>
             <w:r>
-              <w:t>2</w:t>
-            </w:r>
-            <w:r>
-              <w:t>)</w:t>
+              <w:t>2)</w:t>
             </w:r>
           </w:p>
         </w:tc>
@@ -4719,20 +5172,11 @@
         <w:jc w:val="both"/>
       </w:pPr>
       <w:r>
-        <w:t>Diagnostical tests</w:t>
-      </w:r>
-    </w:p>
-    <w:p>
-      <w:pPr>
-        <w:jc w:val="both"/>
-      </w:pPr>
-    </w:p>
-    <w:p>
-      <w:pPr>
-        <w:jc w:val="both"/>
-      </w:pPr>
-      <w:r>
-        <w:t xml:space="preserve">Marginal effects calculations for 2023 indicate that a 1 percentage point increase in AI adoption is associated with a 0.21% to 0.25% reduction in real wage growth, depending on the sector's ICT capacity. This negative coefficient suggests an "automation drag" or wage-restraining effect in the short term. Rapid AI adoption may temporarily suppress wage growth by substituting for specific tasks, thereby reducing the bargaining power of workers in adopting sectors during the implementation phase. </w:t>
+        <w:t xml:space="preserve">Marginal effects calculations for 2023 indicate that a 1 percentage point increase in AI adoption is associated with a 0.21% to 0.25% reduction in real wage growth, depending on the sector's ICT capacity. This negative coefficient suggests an "automation drag" or wage-restraining effect in the short term. Rapid AI adoption may temporarily suppress wage growth by substituting for specific tasks, </w:t>
+      </w:r>
+      <w:r>
+        <w:lastRenderedPageBreak/>
+        <w:t xml:space="preserve">thereby reducing the bargaining power of workers in adopting sectors during the implementation phase. </w:t>
       </w:r>
       <w:r>
         <w:rPr>
@@ -4828,7 +5272,6 @@
         <w:jc w:val="both"/>
       </w:pPr>
       <w:r>
-        <w:lastRenderedPageBreak/>
         <w:t xml:space="preserve">Another thing that we need to notice, VIF analysis </w:t>
       </w:r>
       <w:r>
@@ -5486,7 +5929,11 @@
         <w:t xml:space="preserve"> </w:t>
       </w:r>
       <w:r>
-        <w:t xml:space="preserve">After controlling for unobserved sectoral characteristics and macroeconomic time shocks, sectors that rapidly increased their AI adoption between 2021 and 2024 actually saw a slight decrease in real wage levels relative to their own baseline. </w:t>
+        <w:t xml:space="preserve">After controlling for unobserved sectoral </w:t>
+      </w:r>
+      <w:r>
+        <w:lastRenderedPageBreak/>
+        <w:t xml:space="preserve">characteristics and macroeconomic time shocks, sectors that rapidly increased their AI adoption between 2021 and 2024 actually saw a slight decrease in real wage levels relative to their own baseline. </w:t>
       </w:r>
       <w:r>
         <w:t xml:space="preserve">A 1 </w:t>
@@ -5638,11 +6085,7 @@
       </w:r>
       <w:proofErr w:type="spellEnd"/>
       <w:r>
-        <w:t xml:space="preserve"> is strongly negative </w:t>
-      </w:r>
-      <w:r>
-        <w:lastRenderedPageBreak/>
-        <w:t>(-0.0004, p = 0.0026).</w:t>
+        <w:t> is strongly negative (-0.0004, p = 0.0026).</w:t>
       </w:r>
       <w:r>
         <w:t xml:space="preserve"> </w:t>
@@ -6058,7 +6501,6 @@
         <w:rPr>
           <w:highlight w:val="yellow"/>
         </w:rPr>
-        <w:lastRenderedPageBreak/>
         <w:t>We need to use two-way fixed effects model (entity and time) alongside the between OLS model</w:t>
       </w:r>
       <w:r>
@@ -6891,7 +7333,11 @@
         <w:t xml:space="preserve"> (ignoring the macro inflation shocks 2022)</w:t>
       </w:r>
       <w:r>
-        <w:t>. But if that sector also rapidly increases its ICT training, the marginal wage benefit of the new AI adoption is slightly dampened.</w:t>
+        <w:t xml:space="preserve">. But if that sector also rapidly increases its ICT training, the marginal wage benefit of the </w:t>
+      </w:r>
+      <w:r>
+        <w:lastRenderedPageBreak/>
+        <w:t>new AI adoption is slightly dampened.</w:t>
       </w:r>
       <w:r>
         <w:t xml:space="preserve"> </w:t>
@@ -7033,11 +7479,7 @@
         <w:t xml:space="preserve"> We observe the same patterns, as we discussed above.  </w:t>
       </w:r>
       <w:r>
-        <w:t xml:space="preserve">High-tech sectors have </w:t>
-      </w:r>
-      <w:r>
-        <w:lastRenderedPageBreak/>
-        <w:t>a smaller AI wage premium than low-tech sectors.</w:t>
+        <w:t>High-tech sectors have a smaller AI wage premium than low-tech sectors.</w:t>
       </w:r>
       <w:r>
         <w:t xml:space="preserve"> Additionally, i</w:t>
@@ -7525,21 +7967,35 @@
     <w:p>
       <w:pPr>
         <w:pStyle w:val="Heading2"/>
-      </w:pPr>
-      <w:r>
-        <w:t xml:space="preserve">References: </w:t>
-      </w:r>
-    </w:p>
-    <w:p>
-      <w:pPr>
         <w:rPr>
           <w:lang w:val="pl-PL"/>
         </w:rPr>
       </w:pPr>
+      <w:proofErr w:type="spellStart"/>
       <w:r>
         <w:rPr>
           <w:lang w:val="pl-PL"/>
         </w:rPr>
+        <w:t>References</w:t>
+      </w:r>
+      <w:proofErr w:type="spellEnd"/>
+      <w:r>
+        <w:rPr>
+          <w:lang w:val="pl-PL"/>
+        </w:rPr>
+        <w:t xml:space="preserve">: </w:t>
+      </w:r>
+    </w:p>
+    <w:p>
+      <w:pPr>
+        <w:rPr>
+          <w:lang w:val="pl-PL"/>
+        </w:rPr>
+      </w:pPr>
+      <w:r>
+        <w:rPr>
+          <w:lang w:val="pl-PL"/>
+        </w:rPr>
         <w:t xml:space="preserve">W </w:t>
       </w:r>
       <w:r>
@@ -7548,27 +8004,13 @@
         </w:rPr>
         <w:t xml:space="preserve">2013 - </w:t>
       </w:r>
-      <w:hyperlink r:id="rId7" w:history="1">
+      <w:hyperlink r:id="rId8" w:history="1">
         <w:r>
           <w:rPr>
             <w:rStyle w:val="Hyperlink"/>
             <w:lang w:val="pl-PL"/>
           </w:rPr>
-          <w:t>https:</w:t>
-        </w:r>
-        <w:r>
-          <w:rPr>
-            <w:rStyle w:val="Hyperlink"/>
-            <w:lang w:val="pl-PL"/>
-          </w:rPr>
-          <w:t>/</w:t>
-        </w:r>
-        <w:r>
-          <w:rPr>
-            <w:rStyle w:val="Hyperlink"/>
-            <w:lang w:val="pl-PL"/>
-          </w:rPr>
-          <w:t>/cbpbu.ac.in/userfiles/file/2020/STUDY_MAT/ECO/2.pdf</w:t>
+          <w:t>https://cbpbu.ac.in/userfiles/file/2020/STUDY_MAT/ECO/2.pdf</w:t>
         </w:r>
       </w:hyperlink>
       <w:r>
@@ -7590,7 +8032,7 @@
         </w:rPr>
         <w:t xml:space="preserve">LE 2000 - </w:t>
       </w:r>
-      <w:hyperlink r:id="rId8" w:history="1">
+      <w:hyperlink r:id="rId9" w:history="1">
         <w:r>
           <w:rPr>
             <w:rStyle w:val="Hyperlink"/>
@@ -7607,7 +8049,7 @@
       <w:r>
         <w:t xml:space="preserve">85 - </w:t>
       </w:r>
-      <w:hyperlink r:id="rId9" w:history="1">
+      <w:hyperlink r:id="rId10" w:history="1">
         <w:r>
           <w:rPr>
             <w:rStyle w:val="Hyperlink"/>
@@ -7629,34 +8071,22 @@
         <w:rPr>
           <w:lang w:val="pl-PL"/>
         </w:rPr>
-        <w:t>EU stat1</w:t>
-      </w:r>
-      <w:r>
+        <w:t>EU stat1 – https://ec.europa.eu/eurostat/web/products-eurostat-news/w/ddn-20230309-2</w:t>
+      </w:r>
+    </w:p>
+    <w:p>
+      <w:pPr>
         <w:rPr>
           <w:lang w:val="pl-PL"/>
         </w:rPr>
-        <w:t xml:space="preserve"> – </w:t>
-      </w:r>
+      </w:pPr>
       <w:r>
         <w:rPr>
           <w:lang w:val="pl-PL"/>
         </w:rPr>
-        <w:t>https://ec.europa.eu/eurostat/web/products-eurostat-news/w/ddn-20230309-2</w:t>
-      </w:r>
-    </w:p>
-    <w:p>
-      <w:pPr>
-        <w:rPr>
-          <w:lang w:val="pl-PL"/>
-        </w:rPr>
-      </w:pPr>
-      <w:r>
-        <w:rPr>
-          <w:lang w:val="pl-PL"/>
-        </w:rPr>
         <w:t xml:space="preserve">CB1 - </w:t>
       </w:r>
-      <w:hyperlink r:id="rId10" w:history="1">
+      <w:hyperlink r:id="rId11" w:history="1">
         <w:r>
           <w:rPr>
             <w:rStyle w:val="Hyperlink"/>
@@ -7674,17 +8104,18 @@
     </w:p>
     <w:p>
       <w:r>
-        <w:t xml:space="preserve">R 1969 - </w:t>
-      </w:r>
-      <w:r>
-        <w:t>https://watermark02.silverchair.com/jrsssb_31_2_350.pdf?token=AQECAHi208BE49Ooan9kkhW_Ercy7Dm3ZL_9Cf3qfKAc485ysgAAA2cwggNjBgkqhkiG9w0BBwagggNUMIIDUAIBADCCA0kGCSqGSIb3DQEHATAeBglghkgBZQMEAS4wEQQMQvpMyfGmE6ifJcViAgEQgIIDGmWCBJMcEQla02TtdufRewBkuYAlZYCk1BkE_9MmOrltbsqAL7aqXZk6iT-_t6APjV74sTLTpzo0Rgfn0Mnaga1rY7Xr2AvNWvSDB4IgndPW8g6uLuOUKkrcv2TMmM0Q8TlSMG29ndLCfFzhKHfth-H5OeWWsUZBy_lK2ZCZ9GCEMgu0xE93Smu_zqYqHKCQRSg7ff37Ty8cTEaHuOuGVw2monLH9WxzYm52lRgPRszswc3I3BbyOWoptHM_I45oAKvL4YDmenP8Lou8iaKqzdCNNcqQbXC2W4EzKEswEaAimC4tWTEjCc70SA9BRKyM3J6cYi_qxH8o_9zoPhWZIg8Rx57z3kpT8ACHy1WryUXWdQH3qgp061uWXE-OSa7ppd8-yq4P64JwyUlANsAe-PEF1lLLnzo9j1pOe9MW93Gyf2BmP4Pfp0XZXJpWXzOnWygh5A_LjpYUPyyU7Qh8K9jWaS53oHWT50y52UGjaA1zqALL5FKBAGMJ0f5wbfMl10YVIBze68EGVi7eapZYxZP7R0yjHmxLoPFbTTv6seWURo5fSesvZOODjIQU3CKEzwGqTKEc1tt4xxalfTw121m4k0IzlFZ6AgNndTi7gKj6OOb-qCjpfRqAlVXZJ3zDDDI4_tXOhsDLX0_RDkBgeZB34A3lspmiR31v1XOCqP66xzpyAPZEYQvEVtJfi6xpBkcYSljLvSVKpgHDAo76o7M8g_U_JAzdNaHdxb85XwUsttK9-IlDrjx9VW45vA7Wruiz-S-SrtefmEgpIRBlXWD4D_8Qqx2YCipC7OR7SNy87Oirb6LkN1zQEPi93klEMZtTlB8HkU03fiYH9nApmCrDNMVzO-J-QygyurOKd_pfzhuWRuoli0YjbJvj7st3RhLMCxR_mxR8ieAUvNiHFhx1V4hyES9j71JZIoEEVuuxQWqyh2wcLael68jvlJQhupJ9093wepzqNpQ0V3CEvYu39Kei3LXflgrIotS5o7f7DMdZqp5U8PBK5gWlyn3snG_7YoM8ljyZpJxLLGfF0lRYSLvDPhomJRO9</w:t>
+        <w:t>R 1969 - https://watermark02.silverchair.com/jrsssb_31_2_350.pdf?token=AQECAHi208BE49Ooan9kkhW_Ercy7Dm3ZL_9Cf3qfKAc485ysgAAA2cwggNjBgkqhkiG9w0BBwagggNUMIIDUAIBADCCA0kGCSqGSIb3DQEHATAeBglghkgBZQMEAS4wEQQMQvpMyfGmE6ifJcViAgEQgIIDGmWCBJMcEQla02TtdufRewBkuYAlZYCk1BkE_9MmOrltbsqAL7aqXZk6iT-_t6APjV74sTLTpzo0Rgfn0Mnaga1rY7Xr2AvNWvSDB4IgndPW8g6uLuOUKkrcv2TMmM0Q8TlSMG29ndLCfFzhKHfth-H5OeWWsUZBy_lK2ZCZ9GCEMgu0xE93Smu_zqYqHKCQRSg7ff37Ty8cTEaHuOuGVw2monLH9WxzYm52lRgPRszswc3I3BbyOWoptHM_I45oAKvL4YDmenP8Lou8iaKqzdCNNcqQbXC2W4EzKEswEaAimC4tWTEjCc70SA9BRKyM3J6cYi_qxH8o_9zoPhWZIg8Rx57z3kpT8ACHy1WryUXWdQH3qgp061uWXE-OSa7ppd8-yq4P64JwyUlANsAe-PEF1lLLnzo9j1pOe9MW93Gyf2BmP4Pfp0XZXJpWXzOnWygh5A_LjpYUPyyU7Qh8K9jWaS53oHWT50y</w:t>
+      </w:r>
+      <w:r>
+        <w:lastRenderedPageBreak/>
+        <w:t>52UGjaA1zqALL5FKBAGMJ0f5wbfMl10YVIBze68EGVi7eapZYxZP7R0yjHmxLoPFbTTv6seWURo5fSesvZOODjIQU3CKEzwGqTKEc1tt4xxalfTw121m4k0IzlFZ6AgNndTi7gKj6OOb-qCjpfRqAlVXZJ3zDDDI4_tXOhsDLX0_RDkBgeZB34A3lspmiR31v1XOCqP66xzpyAPZEYQvEVtJfi6xpBkcYSljLvSVKpgHDAo76o7M8g_U_JAzdNaHdxb85XwUsttK9-IlDrjx9VW45vA7Wruiz-S-SrtefmEgpIRBlXWD4D_8Qqx2YCipC7OR7SNy87Oirb6LkN1zQEPi93klEMZtTlB8HkU03fiYH9nApmCrDNMVzO-J-QygyurOKd_pfzhuWRuoli0YjbJvj7st3RhLMCxR_mxR8ieAUvNiHFhx1V4hyES9j71JZIoEEVuuxQWqyh2wcLael68jvlJQhupJ9093wepzqNpQ0V3CEvYu39Kei3LXflgrIotS5o7f7DMdZqp5U8PBK5gWlyn3snG_7YoM8ljyZpJxLLGfF0lRYSLvDPhomJRO9</w:t>
       </w:r>
     </w:p>
     <w:p>
       <w:r>
         <w:t xml:space="preserve">Alis 2012 - </w:t>
       </w:r>
-      <w:hyperlink r:id="rId11" w:history="1">
+      <w:hyperlink r:id="rId12" w:history="1">
         <w:r>
           <w:rPr>
             <w:rStyle w:val="Hyperlink"/>
@@ -7700,7 +8131,7 @@
       <w:r>
         <w:t xml:space="preserve">Akaike - </w:t>
       </w:r>
-      <w:hyperlink r:id="rId12" w:history="1">
+      <w:hyperlink r:id="rId13" w:history="1">
         <w:r>
           <w:rPr>
             <w:rStyle w:val="Hyperlink"/>
@@ -7729,7 +8160,7 @@
         </w:rPr>
         <w:t xml:space="preserve"> -</w:t>
       </w:r>
-      <w:hyperlink r:id="rId13" w:history="1">
+      <w:hyperlink r:id="rId14" w:history="1">
         <w:r>
           <w:rPr>
             <w:rStyle w:val="Hyperlink"/>
@@ -7747,6 +8178,67 @@
     </w:p>
     <w:p>
       <w:pPr>
+        <w:jc w:val="both"/>
+      </w:pPr>
+      <w:proofErr w:type="spellStart"/>
+      <w:r>
+        <w:t>Acemogl</w:t>
+      </w:r>
+      <w:proofErr w:type="spellEnd"/>
+      <w:r>
+        <w:t xml:space="preserve"> and Restrepo - </w:t>
+      </w:r>
+      <w:hyperlink r:id="rId15" w:history="1">
+        <w:r>
+          <w:rPr>
+            <w:rStyle w:val="Hyperlink"/>
+          </w:rPr>
+          <w:t>https://pascual.scripts.mit.edu/research/taskdisplacement/task_displacement.pdf</w:t>
+        </w:r>
+      </w:hyperlink>
+    </w:p>
+    <w:p>
+      <w:hyperlink r:id="rId16" w:history="1">
+        <w:r>
+          <w:rPr>
+            <w:rStyle w:val="Hyperlink"/>
+          </w:rPr>
+          <w:t>https://wiiw.ac.at/assessing-the-impact-of-new-technologies-on-wages-and-labour-income-shares-dlp-6773.pdf</w:t>
+        </w:r>
+      </w:hyperlink>
+    </w:p>
+    <w:p>
+      <w:pPr>
+        <w:rPr>
+          <w:lang w:val="pl-PL"/>
+        </w:rPr>
+      </w:pPr>
+      <w:proofErr w:type="spellStart"/>
+      <w:r>
+        <w:rPr>
+          <w:lang w:val="pl-PL"/>
+        </w:rPr>
+        <w:t>Soc</w:t>
+      </w:r>
+      <w:proofErr w:type="spellEnd"/>
+      <w:r>
+        <w:rPr>
+          <w:lang w:val="pl-PL"/>
+        </w:rPr>
+        <w:t xml:space="preserve"> EU - </w:t>
+      </w:r>
+      <w:hyperlink r:id="rId17" w:history="1">
+        <w:r>
+          <w:rPr>
+            <w:rStyle w:val="Hyperlink"/>
+            <w:lang w:val="pl-PL"/>
+          </w:rPr>
+          <w:t>https://www.socialeurope.eu/from-inflation-shock-to-a-sharp-distributional-conflict</w:t>
+        </w:r>
+      </w:hyperlink>
+    </w:p>
+    <w:p>
+      <w:pPr>
         <w:rPr>
           <w:lang w:val="pl-PL"/>
         </w:rPr>
@@ -13021,7 +13513,163 @@
           <w:lang w:eastAsia="en-GB"/>
           <w14:ligatures w14:val="none"/>
         </w:rPr>
-        <w:t xml:space="preserve"> * </w:t>
+        <w:t xml:space="preserve"> * ict_tr_ij)                                                     -0.000***</w:t>
+      </w:r>
+    </w:p>
+    <w:p>
+      <w:pPr>
+        <w:spacing w:after="0" w:line="240" w:lineRule="auto"/>
+        <w:rPr>
+          <w:rFonts w:ascii="Consolas" w:eastAsia="Times New Roman" w:hAnsi="Consolas" w:cs="Times New Roman"/>
+          <w:color w:val="000000" w:themeColor="text1"/>
+          <w:kern w:val="0"/>
+          <w:sz w:val="21"/>
+          <w:szCs w:val="21"/>
+          <w:lang w:eastAsia="en-GB"/>
+          <w14:ligatures w14:val="none"/>
+        </w:rPr>
+      </w:pPr>
+      <w:r>
+        <w:rPr>
+          <w:rFonts w:ascii="Consolas" w:eastAsia="Times New Roman" w:hAnsi="Consolas" w:cs="Times New Roman"/>
+          <w:color w:val="000000" w:themeColor="text1"/>
+          <w:kern w:val="0"/>
+          <w:sz w:val="21"/>
+          <w:szCs w:val="21"/>
+          <w:lang w:eastAsia="en-GB"/>
+          <w14:ligatures w14:val="none"/>
+        </w:rPr>
+        <w:t xml:space="preserve">                                                                         (0.000)  </w:t>
+      </w:r>
+    </w:p>
+    <w:p>
+      <w:pPr>
+        <w:spacing w:after="0" w:line="240" w:lineRule="auto"/>
+        <w:rPr>
+          <w:rFonts w:ascii="Consolas" w:eastAsia="Times New Roman" w:hAnsi="Consolas" w:cs="Times New Roman"/>
+          <w:color w:val="000000" w:themeColor="text1"/>
+          <w:kern w:val="0"/>
+          <w:sz w:val="21"/>
+          <w:szCs w:val="21"/>
+          <w:lang w:eastAsia="en-GB"/>
+          <w14:ligatures w14:val="none"/>
+        </w:rPr>
+      </w:pPr>
+      <w:r>
+        <w:rPr>
+          <w:rFonts w:ascii="Consolas" w:eastAsia="Times New Roman" w:hAnsi="Consolas" w:cs="Times New Roman"/>
+          <w:color w:val="000000" w:themeColor="text1"/>
+          <w:kern w:val="0"/>
+          <w:sz w:val="21"/>
+          <w:szCs w:val="21"/>
+          <w:lang w:eastAsia="en-GB"/>
+          <w14:ligatures w14:val="none"/>
+        </w:rPr>
+        <w:t xml:space="preserve">R-squared              0.982     0.913     0.980     0.983     0.981     0.984    </w:t>
+      </w:r>
+    </w:p>
+    <w:p>
+      <w:pPr>
+        <w:spacing w:after="0" w:line="240" w:lineRule="auto"/>
+        <w:rPr>
+          <w:rFonts w:ascii="Consolas" w:eastAsia="Times New Roman" w:hAnsi="Consolas" w:cs="Times New Roman"/>
+          <w:color w:val="000000" w:themeColor="text1"/>
+          <w:kern w:val="0"/>
+          <w:sz w:val="21"/>
+          <w:szCs w:val="21"/>
+          <w:lang w:eastAsia="en-GB"/>
+          <w14:ligatures w14:val="none"/>
+        </w:rPr>
+      </w:pPr>
+      <w:r>
+        <w:rPr>
+          <w:rFonts w:ascii="Consolas" w:eastAsia="Times New Roman" w:hAnsi="Consolas" w:cs="Times New Roman"/>
+          <w:color w:val="000000" w:themeColor="text1"/>
+          <w:kern w:val="0"/>
+          <w:sz w:val="21"/>
+          <w:szCs w:val="21"/>
+          <w:lang w:eastAsia="en-GB"/>
+          <w14:ligatures w14:val="none"/>
+        </w:rPr>
+        <w:t xml:space="preserve">R-squared Adj.         0.976     0.907     0.973     0.976     0.975     0.978    </w:t>
+      </w:r>
+    </w:p>
+    <w:p>
+      <w:pPr>
+        <w:spacing w:after="0" w:line="240" w:lineRule="auto"/>
+        <w:rPr>
+          <w:rFonts w:ascii="Consolas" w:eastAsia="Times New Roman" w:hAnsi="Consolas" w:cs="Times New Roman"/>
+          <w:color w:val="000000" w:themeColor="text1"/>
+          <w:kern w:val="0"/>
+          <w:sz w:val="21"/>
+          <w:szCs w:val="21"/>
+          <w:lang w:eastAsia="en-GB"/>
+          <w14:ligatures w14:val="none"/>
+        </w:rPr>
+      </w:pPr>
+      <w:r>
+        <w:rPr>
+          <w:rFonts w:ascii="Consolas" w:eastAsia="Times New Roman" w:hAnsi="Consolas" w:cs="Times New Roman"/>
+          <w:color w:val="000000" w:themeColor="text1"/>
+          <w:kern w:val="0"/>
+          <w:sz w:val="21"/>
+          <w:szCs w:val="21"/>
+          <w:lang w:eastAsia="en-GB"/>
+          <w14:ligatures w14:val="none"/>
+        </w:rPr>
+        <w:t xml:space="preserve">AIC                    -223.5    -67.5     -212.9    -228.2    -218.9    -237.9   </w:t>
+      </w:r>
+    </w:p>
+    <w:p>
+      <w:pPr>
+        <w:spacing w:after="0" w:line="240" w:lineRule="auto"/>
+        <w:rPr>
+          <w:rFonts w:ascii="Consolas" w:eastAsia="Times New Roman" w:hAnsi="Consolas" w:cs="Times New Roman"/>
+          <w:color w:val="000000" w:themeColor="text1"/>
+          <w:kern w:val="0"/>
+          <w:sz w:val="21"/>
+          <w:szCs w:val="21"/>
+          <w:lang w:eastAsia="en-GB"/>
+          <w14:ligatures w14:val="none"/>
+        </w:rPr>
+      </w:pPr>
+      <w:r>
+        <w:rPr>
+          <w:rFonts w:ascii="Consolas" w:eastAsia="Times New Roman" w:hAnsi="Consolas" w:cs="Times New Roman"/>
+          <w:color w:val="000000" w:themeColor="text1"/>
+          <w:kern w:val="0"/>
+          <w:sz w:val="21"/>
+          <w:szCs w:val="21"/>
+          <w:lang w:eastAsia="en-GB"/>
+          <w14:ligatures w14:val="none"/>
+        </w:rPr>
+        <w:t xml:space="preserve">BIC                    -116.3    -41.4     -108.6    -121.0    -114.5    -130.7   </w:t>
+      </w:r>
+    </w:p>
+    <w:p>
+      <w:pPr>
+        <w:spacing w:after="0" w:line="240" w:lineRule="auto"/>
+        <w:rPr>
+          <w:rFonts w:ascii="Consolas" w:eastAsia="Times New Roman" w:hAnsi="Consolas" w:cs="Times New Roman"/>
+          <w:color w:val="000000" w:themeColor="text1"/>
+          <w:kern w:val="0"/>
+          <w:sz w:val="21"/>
+          <w:szCs w:val="21"/>
+          <w:lang w:eastAsia="en-GB"/>
+          <w14:ligatures w14:val="none"/>
+        </w:rPr>
+      </w:pPr>
+      <w:r>
+        <w:rPr>
+          <w:rFonts w:ascii="Consolas" w:eastAsia="Times New Roman" w:hAnsi="Consolas" w:cs="Times New Roman"/>
+          <w:color w:val="000000" w:themeColor="text1"/>
+          <w:kern w:val="0"/>
+          <w:sz w:val="21"/>
+          <w:szCs w:val="21"/>
+          <w:lang w:eastAsia="en-GB"/>
+          <w14:ligatures w14:val="none"/>
+        </w:rPr>
+        <w:t xml:space="preserve">Country FE             Yes       No        Yes       </w:t>
       </w:r>
       <w:proofErr w:type="spellStart"/>
       <w:r>
@@ -13034,7 +13682,7 @@
           <w:lang w:eastAsia="en-GB"/>
           <w14:ligatures w14:val="none"/>
         </w:rPr>
-        <w:t>ict_tr_ij</w:t>
+        <w:t>Yes</w:t>
       </w:r>
       <w:proofErr w:type="spellEnd"/>
       <w:r>
@@ -13047,241 +13695,7 @@
           <w:lang w:eastAsia="en-GB"/>
           <w14:ligatures w14:val="none"/>
         </w:rPr>
-        <w:t>)                                                     -0.000***</w:t>
-      </w:r>
-    </w:p>
-    <w:p>
-      <w:pPr>
-        <w:spacing w:after="0" w:line="240" w:lineRule="auto"/>
-        <w:rPr>
-          <w:rFonts w:ascii="Consolas" w:eastAsia="Times New Roman" w:hAnsi="Consolas" w:cs="Times New Roman"/>
-          <w:color w:val="000000" w:themeColor="text1"/>
-          <w:kern w:val="0"/>
-          <w:sz w:val="21"/>
-          <w:szCs w:val="21"/>
-          <w:lang w:eastAsia="en-GB"/>
-          <w14:ligatures w14:val="none"/>
-        </w:rPr>
-      </w:pPr>
-      <w:r>
-        <w:rPr>
-          <w:rFonts w:ascii="Consolas" w:eastAsia="Times New Roman" w:hAnsi="Consolas" w:cs="Times New Roman"/>
-          <w:color w:val="000000" w:themeColor="text1"/>
-          <w:kern w:val="0"/>
-          <w:sz w:val="21"/>
-          <w:szCs w:val="21"/>
-          <w:lang w:eastAsia="en-GB"/>
-          <w14:ligatures w14:val="none"/>
-        </w:rPr>
-        <w:t xml:space="preserve">                                                                         (0.000)  </w:t>
-      </w:r>
-    </w:p>
-    <w:p>
-      <w:pPr>
-        <w:spacing w:after="0" w:line="240" w:lineRule="auto"/>
-        <w:rPr>
-          <w:rFonts w:ascii="Consolas" w:eastAsia="Times New Roman" w:hAnsi="Consolas" w:cs="Times New Roman"/>
-          <w:color w:val="000000" w:themeColor="text1"/>
-          <w:kern w:val="0"/>
-          <w:sz w:val="21"/>
-          <w:szCs w:val="21"/>
-          <w:lang w:eastAsia="en-GB"/>
-          <w14:ligatures w14:val="none"/>
-        </w:rPr>
-      </w:pPr>
-      <w:r>
-        <w:rPr>
-          <w:rFonts w:ascii="Consolas" w:eastAsia="Times New Roman" w:hAnsi="Consolas" w:cs="Times New Roman"/>
-          <w:color w:val="000000" w:themeColor="text1"/>
-          <w:kern w:val="0"/>
-          <w:sz w:val="21"/>
-          <w:szCs w:val="21"/>
-          <w:lang w:eastAsia="en-GB"/>
-          <w14:ligatures w14:val="none"/>
-        </w:rPr>
-        <w:t xml:space="preserve">R-squared              0.982     0.913     0.980     0.983     0.981     0.984    </w:t>
-      </w:r>
-    </w:p>
-    <w:p>
-      <w:pPr>
-        <w:spacing w:after="0" w:line="240" w:lineRule="auto"/>
-        <w:rPr>
-          <w:rFonts w:ascii="Consolas" w:eastAsia="Times New Roman" w:hAnsi="Consolas" w:cs="Times New Roman"/>
-          <w:color w:val="000000" w:themeColor="text1"/>
-          <w:kern w:val="0"/>
-          <w:sz w:val="21"/>
-          <w:szCs w:val="21"/>
-          <w:lang w:eastAsia="en-GB"/>
-          <w14:ligatures w14:val="none"/>
-        </w:rPr>
-      </w:pPr>
-      <w:r>
-        <w:rPr>
-          <w:rFonts w:ascii="Consolas" w:eastAsia="Times New Roman" w:hAnsi="Consolas" w:cs="Times New Roman"/>
-          <w:color w:val="000000" w:themeColor="text1"/>
-          <w:kern w:val="0"/>
-          <w:sz w:val="21"/>
-          <w:szCs w:val="21"/>
-          <w:lang w:eastAsia="en-GB"/>
-          <w14:ligatures w14:val="none"/>
-        </w:rPr>
-        <w:t xml:space="preserve">R-squared Adj.         0.976     0.907     0.973     0.976     0.975     0.978    </w:t>
-      </w:r>
-    </w:p>
-    <w:p>
-      <w:pPr>
-        <w:spacing w:after="0" w:line="240" w:lineRule="auto"/>
-        <w:rPr>
-          <w:rFonts w:ascii="Consolas" w:eastAsia="Times New Roman" w:hAnsi="Consolas" w:cs="Times New Roman"/>
-          <w:color w:val="000000" w:themeColor="text1"/>
-          <w:kern w:val="0"/>
-          <w:sz w:val="21"/>
-          <w:szCs w:val="21"/>
-          <w:lang w:eastAsia="en-GB"/>
-          <w14:ligatures w14:val="none"/>
-        </w:rPr>
-      </w:pPr>
-      <w:r>
-        <w:rPr>
-          <w:rFonts w:ascii="Consolas" w:eastAsia="Times New Roman" w:hAnsi="Consolas" w:cs="Times New Roman"/>
-          <w:color w:val="000000" w:themeColor="text1"/>
-          <w:kern w:val="0"/>
-          <w:sz w:val="21"/>
-          <w:szCs w:val="21"/>
-          <w:lang w:eastAsia="en-GB"/>
-          <w14:ligatures w14:val="none"/>
-        </w:rPr>
-        <w:t xml:space="preserve">AIC                    -223.5    -67.5     -212.9    -228.2    -218.9    -237.9   </w:t>
-      </w:r>
-    </w:p>
-    <w:p>
-      <w:pPr>
-        <w:spacing w:after="0" w:line="240" w:lineRule="auto"/>
-        <w:rPr>
-          <w:rFonts w:ascii="Consolas" w:eastAsia="Times New Roman" w:hAnsi="Consolas" w:cs="Times New Roman"/>
-          <w:color w:val="000000" w:themeColor="text1"/>
-          <w:kern w:val="0"/>
-          <w:sz w:val="21"/>
-          <w:szCs w:val="21"/>
-          <w:lang w:eastAsia="en-GB"/>
-          <w14:ligatures w14:val="none"/>
-        </w:rPr>
-      </w:pPr>
-      <w:r>
-        <w:rPr>
-          <w:rFonts w:ascii="Consolas" w:eastAsia="Times New Roman" w:hAnsi="Consolas" w:cs="Times New Roman"/>
-          <w:color w:val="000000" w:themeColor="text1"/>
-          <w:kern w:val="0"/>
-          <w:sz w:val="21"/>
-          <w:szCs w:val="21"/>
-          <w:lang w:eastAsia="en-GB"/>
-          <w14:ligatures w14:val="none"/>
-        </w:rPr>
-        <w:t xml:space="preserve">BIC                    -116.3    -41.4     -108.6    -121.0    -114.5    -130.7   </w:t>
-      </w:r>
-    </w:p>
-    <w:p>
-      <w:pPr>
-        <w:spacing w:after="0" w:line="240" w:lineRule="auto"/>
-        <w:rPr>
-          <w:rFonts w:ascii="Consolas" w:eastAsia="Times New Roman" w:hAnsi="Consolas" w:cs="Times New Roman"/>
-          <w:color w:val="000000" w:themeColor="text1"/>
-          <w:kern w:val="0"/>
-          <w:sz w:val="21"/>
-          <w:szCs w:val="21"/>
-          <w:lang w:eastAsia="en-GB"/>
-          <w14:ligatures w14:val="none"/>
-        </w:rPr>
-      </w:pPr>
-      <w:r>
-        <w:rPr>
-          <w:rFonts w:ascii="Consolas" w:eastAsia="Times New Roman" w:hAnsi="Consolas" w:cs="Times New Roman"/>
-          <w:color w:val="000000" w:themeColor="text1"/>
-          <w:kern w:val="0"/>
-          <w:sz w:val="21"/>
-          <w:szCs w:val="21"/>
-          <w:lang w:eastAsia="en-GB"/>
-          <w14:ligatures w14:val="none"/>
-        </w:rPr>
-        <w:t xml:space="preserve">Country FE             Yes       No        Yes       </w:t>
-      </w:r>
-      <w:proofErr w:type="spellStart"/>
-      <w:r>
-        <w:rPr>
-          <w:rFonts w:ascii="Consolas" w:eastAsia="Times New Roman" w:hAnsi="Consolas" w:cs="Times New Roman"/>
-          <w:color w:val="000000" w:themeColor="text1"/>
-          <w:kern w:val="0"/>
-          <w:sz w:val="21"/>
-          <w:szCs w:val="21"/>
-          <w:lang w:eastAsia="en-GB"/>
-          <w14:ligatures w14:val="none"/>
-        </w:rPr>
-        <w:t>Yes</w:t>
-      </w:r>
-      <w:proofErr w:type="spellEnd"/>
-      <w:r>
-        <w:rPr>
-          <w:rFonts w:ascii="Consolas" w:eastAsia="Times New Roman" w:hAnsi="Consolas" w:cs="Times New Roman"/>
-          <w:color w:val="000000" w:themeColor="text1"/>
-          <w:kern w:val="0"/>
-          <w:sz w:val="21"/>
-          <w:szCs w:val="21"/>
-          <w:lang w:eastAsia="en-GB"/>
-          <w14:ligatures w14:val="none"/>
-        </w:rPr>
-        <w:t xml:space="preserve">       </w:t>
-      </w:r>
-      <w:proofErr w:type="spellStart"/>
-      <w:r>
-        <w:rPr>
-          <w:rFonts w:ascii="Consolas" w:eastAsia="Times New Roman" w:hAnsi="Consolas" w:cs="Times New Roman"/>
-          <w:color w:val="000000" w:themeColor="text1"/>
-          <w:kern w:val="0"/>
-          <w:sz w:val="21"/>
-          <w:szCs w:val="21"/>
-          <w:lang w:eastAsia="en-GB"/>
-          <w14:ligatures w14:val="none"/>
-        </w:rPr>
-        <w:t>Yes</w:t>
-      </w:r>
-      <w:proofErr w:type="spellEnd"/>
-      <w:r>
-        <w:rPr>
-          <w:rFonts w:ascii="Consolas" w:eastAsia="Times New Roman" w:hAnsi="Consolas" w:cs="Times New Roman"/>
-          <w:color w:val="000000" w:themeColor="text1"/>
-          <w:kern w:val="0"/>
-          <w:sz w:val="21"/>
-          <w:szCs w:val="21"/>
-          <w:lang w:eastAsia="en-GB"/>
-          <w14:ligatures w14:val="none"/>
-        </w:rPr>
-        <w:t xml:space="preserve">       </w:t>
-      </w:r>
-      <w:proofErr w:type="spellStart"/>
-      <w:r>
-        <w:rPr>
-          <w:rFonts w:ascii="Consolas" w:eastAsia="Times New Roman" w:hAnsi="Consolas" w:cs="Times New Roman"/>
-          <w:color w:val="000000" w:themeColor="text1"/>
-          <w:kern w:val="0"/>
-          <w:sz w:val="21"/>
-          <w:szCs w:val="21"/>
-          <w:lang w:eastAsia="en-GB"/>
-          <w14:ligatures w14:val="none"/>
-        </w:rPr>
-        <w:t>Yes</w:t>
-      </w:r>
-      <w:proofErr w:type="spellEnd"/>
-      <w:r>
-        <w:rPr>
-          <w:rFonts w:ascii="Consolas" w:eastAsia="Times New Roman" w:hAnsi="Consolas" w:cs="Times New Roman"/>
-          <w:color w:val="000000" w:themeColor="text1"/>
-          <w:kern w:val="0"/>
-          <w:sz w:val="21"/>
-          <w:szCs w:val="21"/>
-          <w:lang w:eastAsia="en-GB"/>
-          <w14:ligatures w14:val="none"/>
-        </w:rPr>
-        <w:t xml:space="preserve">      </w:t>
+        <w:t xml:space="preserve">       Yes       Yes      </w:t>
       </w:r>
     </w:p>
     <w:p>
@@ -15770,33 +16184,7 @@
           <w:lang w:eastAsia="en-GB"/>
           <w14:ligatures w14:val="none"/>
         </w:rPr>
-        <w:t xml:space="preserve"> * </w:t>
-      </w:r>
-      <w:proofErr w:type="spellStart"/>
-      <w:r>
-        <w:rPr>
-          <w:rFonts w:ascii="Consolas" w:eastAsia="Times New Roman" w:hAnsi="Consolas" w:cs="Times New Roman"/>
-          <w:color w:val="000000" w:themeColor="text1"/>
-          <w:kern w:val="0"/>
-          <w:sz w:val="21"/>
-          <w:szCs w:val="21"/>
-          <w:lang w:eastAsia="en-GB"/>
-          <w14:ligatures w14:val="none"/>
-        </w:rPr>
-        <w:t>ict_tr_ij</w:t>
-      </w:r>
-      <w:proofErr w:type="spellEnd"/>
-      <w:r>
-        <w:rPr>
-          <w:rFonts w:ascii="Consolas" w:eastAsia="Times New Roman" w:hAnsi="Consolas" w:cs="Times New Roman"/>
-          <w:color w:val="000000" w:themeColor="text1"/>
-          <w:kern w:val="0"/>
-          <w:sz w:val="21"/>
-          <w:szCs w:val="21"/>
-          <w:lang w:eastAsia="en-GB"/>
-          <w14:ligatures w14:val="none"/>
-        </w:rPr>
-        <w:t>)                                 -0.000***</w:t>
+        <w:t xml:space="preserve"> * ict_tr_ij)                                 -0.000***</w:t>
       </w:r>
     </w:p>
     <w:p>
@@ -15979,59 +16367,7 @@
           <w:lang w:eastAsia="en-GB"/>
           <w14:ligatures w14:val="none"/>
         </w:rPr>
-        <w:t xml:space="preserve">       </w:t>
-      </w:r>
-      <w:proofErr w:type="spellStart"/>
-      <w:r>
-        <w:rPr>
-          <w:rFonts w:ascii="Consolas" w:eastAsia="Times New Roman" w:hAnsi="Consolas" w:cs="Times New Roman"/>
-          <w:color w:val="000000" w:themeColor="text1"/>
-          <w:kern w:val="0"/>
-          <w:sz w:val="21"/>
-          <w:szCs w:val="21"/>
-          <w:lang w:eastAsia="en-GB"/>
-          <w14:ligatures w14:val="none"/>
-        </w:rPr>
-        <w:t>Yes</w:t>
-      </w:r>
-      <w:proofErr w:type="spellEnd"/>
-      <w:r>
-        <w:rPr>
-          <w:rFonts w:ascii="Consolas" w:eastAsia="Times New Roman" w:hAnsi="Consolas" w:cs="Times New Roman"/>
-          <w:color w:val="000000" w:themeColor="text1"/>
-          <w:kern w:val="0"/>
-          <w:sz w:val="21"/>
-          <w:szCs w:val="21"/>
-          <w:lang w:eastAsia="en-GB"/>
-          <w14:ligatures w14:val="none"/>
-        </w:rPr>
-        <w:t xml:space="preserve">       </w:t>
-      </w:r>
-      <w:proofErr w:type="spellStart"/>
-      <w:r>
-        <w:rPr>
-          <w:rFonts w:ascii="Consolas" w:eastAsia="Times New Roman" w:hAnsi="Consolas" w:cs="Times New Roman"/>
-          <w:color w:val="000000" w:themeColor="text1"/>
-          <w:kern w:val="0"/>
-          <w:sz w:val="21"/>
-          <w:szCs w:val="21"/>
-          <w:lang w:eastAsia="en-GB"/>
-          <w14:ligatures w14:val="none"/>
-        </w:rPr>
-        <w:t>Yes</w:t>
-      </w:r>
-      <w:proofErr w:type="spellEnd"/>
-      <w:r>
-        <w:rPr>
-          <w:rFonts w:ascii="Consolas" w:eastAsia="Times New Roman" w:hAnsi="Consolas" w:cs="Times New Roman"/>
-          <w:color w:val="000000" w:themeColor="text1"/>
-          <w:kern w:val="0"/>
-          <w:sz w:val="21"/>
-          <w:szCs w:val="21"/>
-          <w:lang w:eastAsia="en-GB"/>
-          <w14:ligatures w14:val="none"/>
-        </w:rPr>
-        <w:t xml:space="preserve">      </w:t>
+        <w:t xml:space="preserve">       Yes       Yes      </w:t>
       </w:r>
     </w:p>
     <w:p>
@@ -18735,59 +19071,7 @@
           <w:lang w:eastAsia="en-GB"/>
           <w14:ligatures w14:val="none"/>
         </w:rPr>
-        <w:t xml:space="preserve">       </w:t>
-      </w:r>
-      <w:proofErr w:type="spellStart"/>
-      <w:r>
-        <w:rPr>
-          <w:rFonts w:ascii="Consolas" w:eastAsia="Times New Roman" w:hAnsi="Consolas" w:cs="Times New Roman"/>
-          <w:color w:val="000000" w:themeColor="text1"/>
-          <w:kern w:val="0"/>
-          <w:sz w:val="21"/>
-          <w:szCs w:val="21"/>
-          <w:lang w:eastAsia="en-GB"/>
-          <w14:ligatures w14:val="none"/>
-        </w:rPr>
-        <w:t>Yes</w:t>
-      </w:r>
-      <w:proofErr w:type="spellEnd"/>
-      <w:r>
-        <w:rPr>
-          <w:rFonts w:ascii="Consolas" w:eastAsia="Times New Roman" w:hAnsi="Consolas" w:cs="Times New Roman"/>
-          <w:color w:val="000000" w:themeColor="text1"/>
-          <w:kern w:val="0"/>
-          <w:sz w:val="21"/>
-          <w:szCs w:val="21"/>
-          <w:lang w:eastAsia="en-GB"/>
-          <w14:ligatures w14:val="none"/>
-        </w:rPr>
-        <w:t xml:space="preserve">       </w:t>
-      </w:r>
-      <w:proofErr w:type="spellStart"/>
-      <w:r>
-        <w:rPr>
-          <w:rFonts w:ascii="Consolas" w:eastAsia="Times New Roman" w:hAnsi="Consolas" w:cs="Times New Roman"/>
-          <w:color w:val="000000" w:themeColor="text1"/>
-          <w:kern w:val="0"/>
-          <w:sz w:val="21"/>
-          <w:szCs w:val="21"/>
-          <w:lang w:eastAsia="en-GB"/>
-          <w14:ligatures w14:val="none"/>
-        </w:rPr>
-        <w:t>Yes</w:t>
-      </w:r>
-      <w:proofErr w:type="spellEnd"/>
-      <w:r>
-        <w:rPr>
-          <w:rFonts w:ascii="Consolas" w:eastAsia="Times New Roman" w:hAnsi="Consolas" w:cs="Times New Roman"/>
-          <w:color w:val="000000" w:themeColor="text1"/>
-          <w:kern w:val="0"/>
-          <w:sz w:val="21"/>
-          <w:szCs w:val="21"/>
-          <w:lang w:eastAsia="en-GB"/>
-          <w14:ligatures w14:val="none"/>
-        </w:rPr>
-        <w:t xml:space="preserve">      </w:t>
+        <w:t xml:space="preserve">       Yes       Yes      </w:t>
       </w:r>
     </w:p>
     <w:p>
@@ -21277,7 +21561,163 @@
           <w:lang w:eastAsia="en-GB"/>
           <w14:ligatures w14:val="none"/>
         </w:rPr>
-        <w:t xml:space="preserve"> * </w:t>
+        <w:t xml:space="preserve"> * ict_tr_ij)                                 -0.000***</w:t>
+      </w:r>
+    </w:p>
+    <w:p>
+      <w:pPr>
+        <w:spacing w:after="0" w:line="240" w:lineRule="auto"/>
+        <w:rPr>
+          <w:rFonts w:ascii="Consolas" w:eastAsia="Times New Roman" w:hAnsi="Consolas" w:cs="Times New Roman"/>
+          <w:color w:val="000000" w:themeColor="text1"/>
+          <w:kern w:val="0"/>
+          <w:sz w:val="21"/>
+          <w:szCs w:val="21"/>
+          <w:lang w:eastAsia="en-GB"/>
+          <w14:ligatures w14:val="none"/>
+        </w:rPr>
+      </w:pPr>
+      <w:r>
+        <w:rPr>
+          <w:rFonts w:ascii="Consolas" w:eastAsia="Times New Roman" w:hAnsi="Consolas" w:cs="Times New Roman"/>
+          <w:color w:val="000000" w:themeColor="text1"/>
+          <w:kern w:val="0"/>
+          <w:sz w:val="21"/>
+          <w:szCs w:val="21"/>
+          <w:lang w:eastAsia="en-GB"/>
+          <w14:ligatures w14:val="none"/>
+        </w:rPr>
+        <w:t xml:space="preserve">                                                     (0.000)  </w:t>
+      </w:r>
+    </w:p>
+    <w:p>
+      <w:pPr>
+        <w:spacing w:after="0" w:line="240" w:lineRule="auto"/>
+        <w:rPr>
+          <w:rFonts w:ascii="Consolas" w:eastAsia="Times New Roman" w:hAnsi="Consolas" w:cs="Times New Roman"/>
+          <w:color w:val="000000" w:themeColor="text1"/>
+          <w:kern w:val="0"/>
+          <w:sz w:val="21"/>
+          <w:szCs w:val="21"/>
+          <w:lang w:eastAsia="en-GB"/>
+          <w14:ligatures w14:val="none"/>
+        </w:rPr>
+      </w:pPr>
+      <w:r>
+        <w:rPr>
+          <w:rFonts w:ascii="Consolas" w:eastAsia="Times New Roman" w:hAnsi="Consolas" w:cs="Times New Roman"/>
+          <w:color w:val="000000" w:themeColor="text1"/>
+          <w:kern w:val="0"/>
+          <w:sz w:val="21"/>
+          <w:szCs w:val="21"/>
+          <w:lang w:eastAsia="en-GB"/>
+          <w14:ligatures w14:val="none"/>
+        </w:rPr>
+        <w:t xml:space="preserve">R-squared              0.978     0.980     0.978     0.981    </w:t>
+      </w:r>
+    </w:p>
+    <w:p>
+      <w:pPr>
+        <w:spacing w:after="0" w:line="240" w:lineRule="auto"/>
+        <w:rPr>
+          <w:rFonts w:ascii="Consolas" w:eastAsia="Times New Roman" w:hAnsi="Consolas" w:cs="Times New Roman"/>
+          <w:color w:val="000000" w:themeColor="text1"/>
+          <w:kern w:val="0"/>
+          <w:sz w:val="21"/>
+          <w:szCs w:val="21"/>
+          <w:lang w:eastAsia="en-GB"/>
+          <w14:ligatures w14:val="none"/>
+        </w:rPr>
+      </w:pPr>
+      <w:r>
+        <w:rPr>
+          <w:rFonts w:ascii="Consolas" w:eastAsia="Times New Roman" w:hAnsi="Consolas" w:cs="Times New Roman"/>
+          <w:color w:val="000000" w:themeColor="text1"/>
+          <w:kern w:val="0"/>
+          <w:sz w:val="21"/>
+          <w:szCs w:val="21"/>
+          <w:lang w:eastAsia="en-GB"/>
+          <w14:ligatures w14:val="none"/>
+        </w:rPr>
+        <w:t xml:space="preserve">R-squared Adj.         0.970     0.973     0.970     0.974    </w:t>
+      </w:r>
+    </w:p>
+    <w:p>
+      <w:pPr>
+        <w:spacing w:after="0" w:line="240" w:lineRule="auto"/>
+        <w:rPr>
+          <w:rFonts w:ascii="Consolas" w:eastAsia="Times New Roman" w:hAnsi="Consolas" w:cs="Times New Roman"/>
+          <w:color w:val="000000" w:themeColor="text1"/>
+          <w:kern w:val="0"/>
+          <w:sz w:val="21"/>
+          <w:szCs w:val="21"/>
+          <w:lang w:eastAsia="en-GB"/>
+          <w14:ligatures w14:val="none"/>
+        </w:rPr>
+      </w:pPr>
+      <w:r>
+        <w:rPr>
+          <w:rFonts w:ascii="Consolas" w:eastAsia="Times New Roman" w:hAnsi="Consolas" w:cs="Times New Roman"/>
+          <w:color w:val="000000" w:themeColor="text1"/>
+          <w:kern w:val="0"/>
+          <w:sz w:val="21"/>
+          <w:szCs w:val="21"/>
+          <w:lang w:eastAsia="en-GB"/>
+          <w14:ligatures w14:val="none"/>
+        </w:rPr>
+        <w:t xml:space="preserve">AIC                    -217.1    -230.9    -218.2    -239.4   </w:t>
+      </w:r>
+    </w:p>
+    <w:p>
+      <w:pPr>
+        <w:spacing w:after="0" w:line="240" w:lineRule="auto"/>
+        <w:rPr>
+          <w:rFonts w:ascii="Consolas" w:eastAsia="Times New Roman" w:hAnsi="Consolas" w:cs="Times New Roman"/>
+          <w:color w:val="000000" w:themeColor="text1"/>
+          <w:kern w:val="0"/>
+          <w:sz w:val="21"/>
+          <w:szCs w:val="21"/>
+          <w:lang w:eastAsia="en-GB"/>
+          <w14:ligatures w14:val="none"/>
+        </w:rPr>
+      </w:pPr>
+      <w:r>
+        <w:rPr>
+          <w:rFonts w:ascii="Consolas" w:eastAsia="Times New Roman" w:hAnsi="Consolas" w:cs="Times New Roman"/>
+          <w:color w:val="000000" w:themeColor="text1"/>
+          <w:kern w:val="0"/>
+          <w:sz w:val="21"/>
+          <w:szCs w:val="21"/>
+          <w:lang w:eastAsia="en-GB"/>
+          <w14:ligatures w14:val="none"/>
+        </w:rPr>
+        <w:t xml:space="preserve">BIC                    -112.8    -123.6    -113.8    -132.2   </w:t>
+      </w:r>
+    </w:p>
+    <w:p>
+      <w:pPr>
+        <w:spacing w:after="0" w:line="240" w:lineRule="auto"/>
+        <w:rPr>
+          <w:rFonts w:ascii="Consolas" w:eastAsia="Times New Roman" w:hAnsi="Consolas" w:cs="Times New Roman"/>
+          <w:color w:val="000000" w:themeColor="text1"/>
+          <w:kern w:val="0"/>
+          <w:sz w:val="21"/>
+          <w:szCs w:val="21"/>
+          <w:lang w:eastAsia="en-GB"/>
+          <w14:ligatures w14:val="none"/>
+        </w:rPr>
+      </w:pPr>
+      <w:r>
+        <w:rPr>
+          <w:rFonts w:ascii="Consolas" w:eastAsia="Times New Roman" w:hAnsi="Consolas" w:cs="Times New Roman"/>
+          <w:color w:val="000000" w:themeColor="text1"/>
+          <w:kern w:val="0"/>
+          <w:sz w:val="21"/>
+          <w:szCs w:val="21"/>
+          <w:lang w:eastAsia="en-GB"/>
+          <w14:ligatures w14:val="none"/>
+        </w:rPr>
+        <w:t xml:space="preserve">Country FE             Yes       </w:t>
       </w:r>
       <w:proofErr w:type="spellStart"/>
       <w:r>
@@ -21290,7 +21730,7 @@
           <w:lang w:eastAsia="en-GB"/>
           <w14:ligatures w14:val="none"/>
         </w:rPr>
-        <w:t>ict_tr_ij</w:t>
+        <w:t>Yes</w:t>
       </w:r>
       <w:proofErr w:type="spellEnd"/>
       <w:r>
@@ -21303,241 +21743,7 @@
           <w:lang w:eastAsia="en-GB"/>
           <w14:ligatures w14:val="none"/>
         </w:rPr>
-        <w:t>)                                 -0.000***</w:t>
-      </w:r>
-    </w:p>
-    <w:p>
-      <w:pPr>
-        <w:spacing w:after="0" w:line="240" w:lineRule="auto"/>
-        <w:rPr>
-          <w:rFonts w:ascii="Consolas" w:eastAsia="Times New Roman" w:hAnsi="Consolas" w:cs="Times New Roman"/>
-          <w:color w:val="000000" w:themeColor="text1"/>
-          <w:kern w:val="0"/>
-          <w:sz w:val="21"/>
-          <w:szCs w:val="21"/>
-          <w:lang w:eastAsia="en-GB"/>
-          <w14:ligatures w14:val="none"/>
-        </w:rPr>
-      </w:pPr>
-      <w:r>
-        <w:rPr>
-          <w:rFonts w:ascii="Consolas" w:eastAsia="Times New Roman" w:hAnsi="Consolas" w:cs="Times New Roman"/>
-          <w:color w:val="000000" w:themeColor="text1"/>
-          <w:kern w:val="0"/>
-          <w:sz w:val="21"/>
-          <w:szCs w:val="21"/>
-          <w:lang w:eastAsia="en-GB"/>
-          <w14:ligatures w14:val="none"/>
-        </w:rPr>
-        <w:t xml:space="preserve">                                                     (0.000)  </w:t>
-      </w:r>
-    </w:p>
-    <w:p>
-      <w:pPr>
-        <w:spacing w:after="0" w:line="240" w:lineRule="auto"/>
-        <w:rPr>
-          <w:rFonts w:ascii="Consolas" w:eastAsia="Times New Roman" w:hAnsi="Consolas" w:cs="Times New Roman"/>
-          <w:color w:val="000000" w:themeColor="text1"/>
-          <w:kern w:val="0"/>
-          <w:sz w:val="21"/>
-          <w:szCs w:val="21"/>
-          <w:lang w:eastAsia="en-GB"/>
-          <w14:ligatures w14:val="none"/>
-        </w:rPr>
-      </w:pPr>
-      <w:r>
-        <w:rPr>
-          <w:rFonts w:ascii="Consolas" w:eastAsia="Times New Roman" w:hAnsi="Consolas" w:cs="Times New Roman"/>
-          <w:color w:val="000000" w:themeColor="text1"/>
-          <w:kern w:val="0"/>
-          <w:sz w:val="21"/>
-          <w:szCs w:val="21"/>
-          <w:lang w:eastAsia="en-GB"/>
-          <w14:ligatures w14:val="none"/>
-        </w:rPr>
-        <w:t xml:space="preserve">R-squared              0.978     0.980     0.978     0.981    </w:t>
-      </w:r>
-    </w:p>
-    <w:p>
-      <w:pPr>
-        <w:spacing w:after="0" w:line="240" w:lineRule="auto"/>
-        <w:rPr>
-          <w:rFonts w:ascii="Consolas" w:eastAsia="Times New Roman" w:hAnsi="Consolas" w:cs="Times New Roman"/>
-          <w:color w:val="000000" w:themeColor="text1"/>
-          <w:kern w:val="0"/>
-          <w:sz w:val="21"/>
-          <w:szCs w:val="21"/>
-          <w:lang w:eastAsia="en-GB"/>
-          <w14:ligatures w14:val="none"/>
-        </w:rPr>
-      </w:pPr>
-      <w:r>
-        <w:rPr>
-          <w:rFonts w:ascii="Consolas" w:eastAsia="Times New Roman" w:hAnsi="Consolas" w:cs="Times New Roman"/>
-          <w:color w:val="000000" w:themeColor="text1"/>
-          <w:kern w:val="0"/>
-          <w:sz w:val="21"/>
-          <w:szCs w:val="21"/>
-          <w:lang w:eastAsia="en-GB"/>
-          <w14:ligatures w14:val="none"/>
-        </w:rPr>
-        <w:t xml:space="preserve">R-squared Adj.         0.970     0.973     0.970     0.974    </w:t>
-      </w:r>
-    </w:p>
-    <w:p>
-      <w:pPr>
-        <w:spacing w:after="0" w:line="240" w:lineRule="auto"/>
-        <w:rPr>
-          <w:rFonts w:ascii="Consolas" w:eastAsia="Times New Roman" w:hAnsi="Consolas" w:cs="Times New Roman"/>
-          <w:color w:val="000000" w:themeColor="text1"/>
-          <w:kern w:val="0"/>
-          <w:sz w:val="21"/>
-          <w:szCs w:val="21"/>
-          <w:lang w:eastAsia="en-GB"/>
-          <w14:ligatures w14:val="none"/>
-        </w:rPr>
-      </w:pPr>
-      <w:r>
-        <w:rPr>
-          <w:rFonts w:ascii="Consolas" w:eastAsia="Times New Roman" w:hAnsi="Consolas" w:cs="Times New Roman"/>
-          <w:color w:val="000000" w:themeColor="text1"/>
-          <w:kern w:val="0"/>
-          <w:sz w:val="21"/>
-          <w:szCs w:val="21"/>
-          <w:lang w:eastAsia="en-GB"/>
-          <w14:ligatures w14:val="none"/>
-        </w:rPr>
-        <w:t xml:space="preserve">AIC                    -217.1    -230.9    -218.2    -239.4   </w:t>
-      </w:r>
-    </w:p>
-    <w:p>
-      <w:pPr>
-        <w:spacing w:after="0" w:line="240" w:lineRule="auto"/>
-        <w:rPr>
-          <w:rFonts w:ascii="Consolas" w:eastAsia="Times New Roman" w:hAnsi="Consolas" w:cs="Times New Roman"/>
-          <w:color w:val="000000" w:themeColor="text1"/>
-          <w:kern w:val="0"/>
-          <w:sz w:val="21"/>
-          <w:szCs w:val="21"/>
-          <w:lang w:eastAsia="en-GB"/>
-          <w14:ligatures w14:val="none"/>
-        </w:rPr>
-      </w:pPr>
-      <w:r>
-        <w:rPr>
-          <w:rFonts w:ascii="Consolas" w:eastAsia="Times New Roman" w:hAnsi="Consolas" w:cs="Times New Roman"/>
-          <w:color w:val="000000" w:themeColor="text1"/>
-          <w:kern w:val="0"/>
-          <w:sz w:val="21"/>
-          <w:szCs w:val="21"/>
-          <w:lang w:eastAsia="en-GB"/>
-          <w14:ligatures w14:val="none"/>
-        </w:rPr>
-        <w:t xml:space="preserve">BIC                    -112.8    -123.6    -113.8    -132.2   </w:t>
-      </w:r>
-    </w:p>
-    <w:p>
-      <w:pPr>
-        <w:spacing w:after="0" w:line="240" w:lineRule="auto"/>
-        <w:rPr>
-          <w:rFonts w:ascii="Consolas" w:eastAsia="Times New Roman" w:hAnsi="Consolas" w:cs="Times New Roman"/>
-          <w:color w:val="000000" w:themeColor="text1"/>
-          <w:kern w:val="0"/>
-          <w:sz w:val="21"/>
-          <w:szCs w:val="21"/>
-          <w:lang w:eastAsia="en-GB"/>
-          <w14:ligatures w14:val="none"/>
-        </w:rPr>
-      </w:pPr>
-      <w:r>
-        <w:rPr>
-          <w:rFonts w:ascii="Consolas" w:eastAsia="Times New Roman" w:hAnsi="Consolas" w:cs="Times New Roman"/>
-          <w:color w:val="000000" w:themeColor="text1"/>
-          <w:kern w:val="0"/>
-          <w:sz w:val="21"/>
-          <w:szCs w:val="21"/>
-          <w:lang w:eastAsia="en-GB"/>
-          <w14:ligatures w14:val="none"/>
-        </w:rPr>
-        <w:t xml:space="preserve">Country FE             Yes       </w:t>
-      </w:r>
-      <w:proofErr w:type="spellStart"/>
-      <w:r>
-        <w:rPr>
-          <w:rFonts w:ascii="Consolas" w:eastAsia="Times New Roman" w:hAnsi="Consolas" w:cs="Times New Roman"/>
-          <w:color w:val="000000" w:themeColor="text1"/>
-          <w:kern w:val="0"/>
-          <w:sz w:val="21"/>
-          <w:szCs w:val="21"/>
-          <w:lang w:eastAsia="en-GB"/>
-          <w14:ligatures w14:val="none"/>
-        </w:rPr>
-        <w:t>Yes</w:t>
-      </w:r>
-      <w:proofErr w:type="spellEnd"/>
-      <w:r>
-        <w:rPr>
-          <w:rFonts w:ascii="Consolas" w:eastAsia="Times New Roman" w:hAnsi="Consolas" w:cs="Times New Roman"/>
-          <w:color w:val="000000" w:themeColor="text1"/>
-          <w:kern w:val="0"/>
-          <w:sz w:val="21"/>
-          <w:szCs w:val="21"/>
-          <w:lang w:eastAsia="en-GB"/>
-          <w14:ligatures w14:val="none"/>
-        </w:rPr>
-        <w:t xml:space="preserve">       </w:t>
-      </w:r>
-      <w:proofErr w:type="spellStart"/>
-      <w:r>
-        <w:rPr>
-          <w:rFonts w:ascii="Consolas" w:eastAsia="Times New Roman" w:hAnsi="Consolas" w:cs="Times New Roman"/>
-          <w:color w:val="000000" w:themeColor="text1"/>
-          <w:kern w:val="0"/>
-          <w:sz w:val="21"/>
-          <w:szCs w:val="21"/>
-          <w:lang w:eastAsia="en-GB"/>
-          <w14:ligatures w14:val="none"/>
-        </w:rPr>
-        <w:t>Yes</w:t>
-      </w:r>
-      <w:proofErr w:type="spellEnd"/>
-      <w:r>
-        <w:rPr>
-          <w:rFonts w:ascii="Consolas" w:eastAsia="Times New Roman" w:hAnsi="Consolas" w:cs="Times New Roman"/>
-          <w:color w:val="000000" w:themeColor="text1"/>
-          <w:kern w:val="0"/>
-          <w:sz w:val="21"/>
-          <w:szCs w:val="21"/>
-          <w:lang w:eastAsia="en-GB"/>
-          <w14:ligatures w14:val="none"/>
-        </w:rPr>
-        <w:t xml:space="preserve">       </w:t>
-      </w:r>
-      <w:proofErr w:type="spellStart"/>
-      <w:r>
-        <w:rPr>
-          <w:rFonts w:ascii="Consolas" w:eastAsia="Times New Roman" w:hAnsi="Consolas" w:cs="Times New Roman"/>
-          <w:color w:val="000000" w:themeColor="text1"/>
-          <w:kern w:val="0"/>
-          <w:sz w:val="21"/>
-          <w:szCs w:val="21"/>
-          <w:lang w:eastAsia="en-GB"/>
-          <w14:ligatures w14:val="none"/>
-        </w:rPr>
-        <w:t>Yes</w:t>
-      </w:r>
-      <w:proofErr w:type="spellEnd"/>
-      <w:r>
-        <w:rPr>
-          <w:rFonts w:ascii="Consolas" w:eastAsia="Times New Roman" w:hAnsi="Consolas" w:cs="Times New Roman"/>
-          <w:color w:val="000000" w:themeColor="text1"/>
-          <w:kern w:val="0"/>
-          <w:sz w:val="21"/>
-          <w:szCs w:val="21"/>
-          <w:lang w:eastAsia="en-GB"/>
-          <w14:ligatures w14:val="none"/>
-        </w:rPr>
-        <w:t xml:space="preserve">      </w:t>
+        <w:t xml:space="preserve">       Yes       Yes      </w:t>
       </w:r>
     </w:p>
     <w:p>
@@ -24223,59 +24429,7 @@
           <w:lang w:eastAsia="en-GB"/>
           <w14:ligatures w14:val="none"/>
         </w:rPr>
-        <w:t xml:space="preserve">       </w:t>
-      </w:r>
-      <w:proofErr w:type="spellStart"/>
-      <w:r>
-        <w:rPr>
-          <w:rFonts w:ascii="Consolas" w:eastAsia="Times New Roman" w:hAnsi="Consolas" w:cs="Times New Roman"/>
-          <w:color w:val="000000" w:themeColor="text1"/>
-          <w:kern w:val="0"/>
-          <w:sz w:val="21"/>
-          <w:szCs w:val="21"/>
-          <w:lang w:eastAsia="en-GB"/>
-          <w14:ligatures w14:val="none"/>
-        </w:rPr>
-        <w:t>Yes</w:t>
-      </w:r>
-      <w:proofErr w:type="spellEnd"/>
-      <w:r>
-        <w:rPr>
-          <w:rFonts w:ascii="Consolas" w:eastAsia="Times New Roman" w:hAnsi="Consolas" w:cs="Times New Roman"/>
-          <w:color w:val="000000" w:themeColor="text1"/>
-          <w:kern w:val="0"/>
-          <w:sz w:val="21"/>
-          <w:szCs w:val="21"/>
-          <w:lang w:eastAsia="en-GB"/>
-          <w14:ligatures w14:val="none"/>
-        </w:rPr>
-        <w:t xml:space="preserve">       </w:t>
-      </w:r>
-      <w:proofErr w:type="spellStart"/>
-      <w:r>
-        <w:rPr>
-          <w:rFonts w:ascii="Consolas" w:eastAsia="Times New Roman" w:hAnsi="Consolas" w:cs="Times New Roman"/>
-          <w:color w:val="000000" w:themeColor="text1"/>
-          <w:kern w:val="0"/>
-          <w:sz w:val="21"/>
-          <w:szCs w:val="21"/>
-          <w:lang w:eastAsia="en-GB"/>
-          <w14:ligatures w14:val="none"/>
-        </w:rPr>
-        <w:t>Yes</w:t>
-      </w:r>
-      <w:proofErr w:type="spellEnd"/>
-      <w:r>
-        <w:rPr>
-          <w:rFonts w:ascii="Consolas" w:eastAsia="Times New Roman" w:hAnsi="Consolas" w:cs="Times New Roman"/>
-          <w:color w:val="000000" w:themeColor="text1"/>
-          <w:kern w:val="0"/>
-          <w:sz w:val="21"/>
-          <w:szCs w:val="21"/>
-          <w:lang w:eastAsia="en-GB"/>
-          <w14:ligatures w14:val="none"/>
-        </w:rPr>
-        <w:t xml:space="preserve">      </w:t>
+        <w:t xml:space="preserve">       Yes       Yes      </w:t>
       </w:r>
     </w:p>
     <w:p>
@@ -25905,59 +26059,7 @@
           <w:lang w:eastAsia="en-GB"/>
           <w14:ligatures w14:val="none"/>
         </w:rPr>
-        <w:t xml:space="preserve">       </w:t>
-      </w:r>
-      <w:proofErr w:type="spellStart"/>
-      <w:r>
-        <w:rPr>
-          <w:rFonts w:ascii="Consolas" w:eastAsia="Times New Roman" w:hAnsi="Consolas" w:cs="Times New Roman"/>
-          <w:color w:val="000000" w:themeColor="text1"/>
-          <w:kern w:val="0"/>
-          <w:sz w:val="21"/>
-          <w:szCs w:val="21"/>
-          <w:lang w:eastAsia="en-GB"/>
-          <w14:ligatures w14:val="none"/>
-        </w:rPr>
-        <w:t>No</w:t>
-      </w:r>
-      <w:proofErr w:type="spellEnd"/>
-      <w:r>
-        <w:rPr>
-          <w:rFonts w:ascii="Consolas" w:eastAsia="Times New Roman" w:hAnsi="Consolas" w:cs="Times New Roman"/>
-          <w:color w:val="000000" w:themeColor="text1"/>
-          <w:kern w:val="0"/>
-          <w:sz w:val="21"/>
-          <w:szCs w:val="21"/>
-          <w:lang w:eastAsia="en-GB"/>
-          <w14:ligatures w14:val="none"/>
-        </w:rPr>
-        <w:t xml:space="preserve">      </w:t>
-      </w:r>
-      <w:proofErr w:type="spellStart"/>
-      <w:r>
-        <w:rPr>
-          <w:rFonts w:ascii="Consolas" w:eastAsia="Times New Roman" w:hAnsi="Consolas" w:cs="Times New Roman"/>
-          <w:color w:val="000000" w:themeColor="text1"/>
-          <w:kern w:val="0"/>
-          <w:sz w:val="21"/>
-          <w:szCs w:val="21"/>
-          <w:lang w:eastAsia="en-GB"/>
-          <w14:ligatures w14:val="none"/>
-        </w:rPr>
-        <w:t>No</w:t>
-      </w:r>
-      <w:proofErr w:type="spellEnd"/>
-      <w:r>
-        <w:rPr>
-          <w:rFonts w:ascii="Consolas" w:eastAsia="Times New Roman" w:hAnsi="Consolas" w:cs="Times New Roman"/>
-          <w:color w:val="000000" w:themeColor="text1"/>
-          <w:kern w:val="0"/>
-          <w:sz w:val="21"/>
-          <w:szCs w:val="21"/>
-          <w:lang w:eastAsia="en-GB"/>
-          <w14:ligatures w14:val="none"/>
-        </w:rPr>
-        <w:t xml:space="preserve">     </w:t>
+        <w:t xml:space="preserve">       No      No     </w:t>
       </w:r>
     </w:p>
     <w:p>
@@ -27584,59 +27686,7 @@
           <w:lang w:eastAsia="en-GB"/>
           <w14:ligatures w14:val="none"/>
         </w:rPr>
-        <w:t xml:space="preserve">        </w:t>
-      </w:r>
-      <w:proofErr w:type="spellStart"/>
-      <w:r>
-        <w:rPr>
-          <w:rFonts w:ascii="Consolas" w:eastAsia="Times New Roman" w:hAnsi="Consolas" w:cs="Times New Roman"/>
-          <w:color w:val="000000" w:themeColor="text1"/>
-          <w:kern w:val="0"/>
-          <w:sz w:val="21"/>
-          <w:szCs w:val="21"/>
-          <w:lang w:eastAsia="en-GB"/>
-          <w14:ligatures w14:val="none"/>
-        </w:rPr>
-        <w:t>No</w:t>
-      </w:r>
-      <w:proofErr w:type="spellEnd"/>
-      <w:r>
-        <w:rPr>
-          <w:rFonts w:ascii="Consolas" w:eastAsia="Times New Roman" w:hAnsi="Consolas" w:cs="Times New Roman"/>
-          <w:color w:val="000000" w:themeColor="text1"/>
-          <w:kern w:val="0"/>
-          <w:sz w:val="21"/>
-          <w:szCs w:val="21"/>
-          <w:lang w:eastAsia="en-GB"/>
-          <w14:ligatures w14:val="none"/>
-        </w:rPr>
-        <w:t xml:space="preserve">        </w:t>
-      </w:r>
-      <w:proofErr w:type="spellStart"/>
-      <w:r>
-        <w:rPr>
-          <w:rFonts w:ascii="Consolas" w:eastAsia="Times New Roman" w:hAnsi="Consolas" w:cs="Times New Roman"/>
-          <w:color w:val="000000" w:themeColor="text1"/>
-          <w:kern w:val="0"/>
-          <w:sz w:val="21"/>
-          <w:szCs w:val="21"/>
-          <w:lang w:eastAsia="en-GB"/>
-          <w14:ligatures w14:val="none"/>
-        </w:rPr>
-        <w:t>No</w:t>
-      </w:r>
-      <w:proofErr w:type="spellEnd"/>
-      <w:r>
-        <w:rPr>
-          <w:rFonts w:ascii="Consolas" w:eastAsia="Times New Roman" w:hAnsi="Consolas" w:cs="Times New Roman"/>
-          <w:color w:val="000000" w:themeColor="text1"/>
-          <w:kern w:val="0"/>
-          <w:sz w:val="21"/>
-          <w:szCs w:val="21"/>
-          <w:lang w:eastAsia="en-GB"/>
-          <w14:ligatures w14:val="none"/>
-        </w:rPr>
-        <w:t xml:space="preserve">       </w:t>
+        <w:t xml:space="preserve">        No        No       </w:t>
       </w:r>
     </w:p>
     <w:p>
@@ -29248,59 +29298,7 @@
           <w:lang w:eastAsia="en-GB"/>
           <w14:ligatures w14:val="none"/>
         </w:rPr>
-        <w:t xml:space="preserve">        </w:t>
-      </w:r>
-      <w:proofErr w:type="spellStart"/>
-      <w:r>
-        <w:rPr>
-          <w:rFonts w:ascii="Consolas" w:eastAsia="Times New Roman" w:hAnsi="Consolas" w:cs="Times New Roman"/>
-          <w:color w:val="000000" w:themeColor="text1"/>
-          <w:kern w:val="0"/>
-          <w:sz w:val="21"/>
-          <w:szCs w:val="21"/>
-          <w:lang w:eastAsia="en-GB"/>
-          <w14:ligatures w14:val="none"/>
-        </w:rPr>
-        <w:t>No</w:t>
-      </w:r>
-      <w:proofErr w:type="spellEnd"/>
-      <w:r>
-        <w:rPr>
-          <w:rFonts w:ascii="Consolas" w:eastAsia="Times New Roman" w:hAnsi="Consolas" w:cs="Times New Roman"/>
-          <w:color w:val="000000" w:themeColor="text1"/>
-          <w:kern w:val="0"/>
-          <w:sz w:val="21"/>
-          <w:szCs w:val="21"/>
-          <w:lang w:eastAsia="en-GB"/>
-          <w14:ligatures w14:val="none"/>
-        </w:rPr>
-        <w:t xml:space="preserve">        </w:t>
-      </w:r>
-      <w:proofErr w:type="spellStart"/>
-      <w:r>
-        <w:rPr>
-          <w:rFonts w:ascii="Consolas" w:eastAsia="Times New Roman" w:hAnsi="Consolas" w:cs="Times New Roman"/>
-          <w:color w:val="000000" w:themeColor="text1"/>
-          <w:kern w:val="0"/>
-          <w:sz w:val="21"/>
-          <w:szCs w:val="21"/>
-          <w:lang w:eastAsia="en-GB"/>
-          <w14:ligatures w14:val="none"/>
-        </w:rPr>
-        <w:t>No</w:t>
-      </w:r>
-      <w:proofErr w:type="spellEnd"/>
-      <w:r>
-        <w:rPr>
-          <w:rFonts w:ascii="Consolas" w:eastAsia="Times New Roman" w:hAnsi="Consolas" w:cs="Times New Roman"/>
-          <w:color w:val="000000" w:themeColor="text1"/>
-          <w:kern w:val="0"/>
-          <w:sz w:val="21"/>
-          <w:szCs w:val="21"/>
-          <w:lang w:eastAsia="en-GB"/>
-          <w14:ligatures w14:val="none"/>
-        </w:rPr>
-        <w:t xml:space="preserve">       </w:t>
+        <w:t xml:space="preserve">        No        No       </w:t>
       </w:r>
     </w:p>
     <w:p>

</xml_diff>